<commit_message>
Adjusted a minor comment
</commit_message>
<xml_diff>
--- a/flutter_documents/flutter_part_two_of_more_documents/f59_dart_build_runner_and_code_generation_packages_in_flutter.docx
+++ b/flutter_documents/flutter_part_two_of_more_documents/f59_dart_build_runner_and_code_generation_packages_in_flutter.docx
@@ -1559,27 +1559,7 @@
           <w:sz w:val="28"/>
           <w:szCs w:val="28"/>
         </w:rPr>
-        <w:t xml:space="preserve">     </w:t>
-      </w:r>
-      <w:proofErr w:type="spellStart"/>
-      <w:r>
-        <w:rPr>
-          <w:b/>
-          <w:bCs/>
-          <w:sz w:val="28"/>
-          <w:szCs w:val="28"/>
-        </w:rPr>
-        <w:t>Freezed</w:t>
-      </w:r>
-      <w:proofErr w:type="spellEnd"/>
-      <w:r>
-        <w:rPr>
-          <w:b/>
-          <w:bCs/>
-          <w:sz w:val="28"/>
-          <w:szCs w:val="28"/>
-        </w:rPr>
-        <w:t xml:space="preserve">                 Retrofit</w:t>
+        <w:t xml:space="preserve">     Freezed                 Retrofit</w:t>
       </w:r>
     </w:p>
     <w:p>
@@ -46625,7 +46605,7 @@
           <w:szCs w:val="32"/>
         </w:rPr>
         <w:lastRenderedPageBreak/>
-        <w:t xml:space="preserve">    final fields = </w:t>
+        <w:t>//</w:t>
       </w:r>
       <w:proofErr w:type="spellStart"/>
       <w:proofErr w:type="gramStart"/>
@@ -46637,10 +46617,86 @@
           <w:sz w:val="32"/>
           <w:szCs w:val="32"/>
         </w:rPr>
+        <w:t>element</w:t>
+      </w:r>
+      <w:r>
+        <w:rPr>
+          <w:b/>
+          <w:bCs/>
+          <w:color w:val="D86DCB" w:themeColor="accent5" w:themeTint="99"/>
+          <w:sz w:val="32"/>
+          <w:szCs w:val="32"/>
+        </w:rPr>
+        <w:t>.fields</w:t>
+      </w:r>
+      <w:proofErr w:type="spellEnd"/>
+      <w:proofErr w:type="gramEnd"/>
+      <w:r>
+        <w:rPr>
+          <w:b/>
+          <w:bCs/>
+          <w:color w:val="D86DCB" w:themeColor="accent5" w:themeTint="99"/>
+          <w:sz w:val="32"/>
+          <w:szCs w:val="32"/>
+        </w:rPr>
+        <w:t xml:space="preserve"> = List of properties in the User class</w:t>
+      </w:r>
+      <w:r>
+        <w:rPr>
+          <w:b/>
+          <w:bCs/>
+          <w:color w:val="D86DCB" w:themeColor="accent5" w:themeTint="99"/>
+          <w:sz w:val="32"/>
+          <w:szCs w:val="32"/>
+        </w:rPr>
+        <w:t xml:space="preserve">    </w:t>
+      </w:r>
+    </w:p>
+    <w:p>
+      <w:pPr>
+        <w:jc w:val="both"/>
+        <w:rPr>
+          <w:b/>
+          <w:bCs/>
+          <w:color w:val="D86DCB" w:themeColor="accent5" w:themeTint="99"/>
+          <w:sz w:val="32"/>
+          <w:szCs w:val="32"/>
+        </w:rPr>
+      </w:pPr>
+      <w:r>
+        <w:rPr>
+          <w:b/>
+          <w:bCs/>
+          <w:color w:val="D86DCB" w:themeColor="accent5" w:themeTint="99"/>
+          <w:sz w:val="32"/>
+          <w:szCs w:val="32"/>
+        </w:rPr>
+        <w:t xml:space="preserve">final fields = </w:t>
+      </w:r>
+      <w:proofErr w:type="spellStart"/>
+      <w:proofErr w:type="gramStart"/>
+      <w:r>
+        <w:rPr>
+          <w:b/>
+          <w:bCs/>
+          <w:color w:val="D86DCB" w:themeColor="accent5" w:themeTint="99"/>
+          <w:sz w:val="32"/>
+          <w:szCs w:val="32"/>
+        </w:rPr>
         <w:t>element.fields</w:t>
       </w:r>
       <w:proofErr w:type="spellEnd"/>
       <w:proofErr w:type="gramEnd"/>
+      <w:r>
+        <w:rPr>
+          <w:b/>
+          <w:bCs/>
+          <w:color w:val="D86DCB" w:themeColor="accent5" w:themeTint="99"/>
+          <w:sz w:val="32"/>
+          <w:szCs w:val="32"/>
+        </w:rPr>
+        <w:t xml:space="preserve">      </w:t>
+      </w:r>
     </w:p>
     <w:p>
       <w:pPr>
@@ -47405,6 +47461,7 @@
           <w:sz w:val="32"/>
           <w:szCs w:val="32"/>
         </w:rPr>
+        <w:lastRenderedPageBreak/>
         <w:t xml:space="preserve"># </w:t>
       </w:r>
       <w:r>
@@ -47440,7 +47497,6 @@
           <w:sz w:val="32"/>
           <w:szCs w:val="32"/>
         </w:rPr>
-        <w:lastRenderedPageBreak/>
         <w:t>We write this so the build system finds the source file</w:t>
       </w:r>
     </w:p>
@@ -48220,6 +48276,7 @@
           <w:sz w:val="28"/>
           <w:szCs w:val="28"/>
         </w:rPr>
+        <w:lastRenderedPageBreak/>
         <w:t>Find @JsonSerializable</w:t>
       </w:r>
     </w:p>
@@ -48240,279 +48297,887 @@
           <w:sz w:val="28"/>
           <w:szCs w:val="28"/>
         </w:rPr>
+        <w:t xml:space="preserve">        ↓</w:t>
+      </w:r>
+    </w:p>
+    <w:p>
+      <w:pPr>
+        <w:jc w:val="both"/>
+        <w:rPr>
+          <w:b/>
+          <w:bCs/>
+          <w:sz w:val="28"/>
+          <w:szCs w:val="28"/>
+        </w:rPr>
+      </w:pPr>
+      <w:r>
+        <w:rPr>
+          <w:b/>
+          <w:bCs/>
+          <w:sz w:val="28"/>
+          <w:szCs w:val="28"/>
+        </w:rPr>
+        <w:t xml:space="preserve">Get </w:t>
+      </w:r>
+      <w:proofErr w:type="spellStart"/>
+      <w:r>
+        <w:rPr>
+          <w:b/>
+          <w:bCs/>
+          <w:sz w:val="28"/>
+          <w:szCs w:val="28"/>
+        </w:rPr>
+        <w:t>ClassElement</w:t>
+      </w:r>
+      <w:proofErr w:type="spellEnd"/>
+    </w:p>
+    <w:p>
+      <w:pPr>
+        <w:jc w:val="both"/>
+        <w:rPr>
+          <w:b/>
+          <w:bCs/>
+          <w:sz w:val="28"/>
+          <w:szCs w:val="28"/>
+        </w:rPr>
+      </w:pPr>
+      <w:r>
+        <w:rPr>
+          <w:b/>
+          <w:bCs/>
+          <w:sz w:val="28"/>
+          <w:szCs w:val="28"/>
+        </w:rPr>
+        <w:t xml:space="preserve">        ↓</w:t>
+      </w:r>
+    </w:p>
+    <w:p>
+      <w:pPr>
+        <w:jc w:val="both"/>
+        <w:rPr>
+          <w:b/>
+          <w:bCs/>
+          <w:sz w:val="28"/>
+          <w:szCs w:val="28"/>
+        </w:rPr>
+      </w:pPr>
+      <w:r>
+        <w:rPr>
+          <w:b/>
+          <w:bCs/>
+          <w:sz w:val="28"/>
+          <w:szCs w:val="28"/>
+        </w:rPr>
+        <w:t>Inspect fields</w:t>
+      </w:r>
+    </w:p>
+    <w:p>
+      <w:pPr>
+        <w:jc w:val="both"/>
+        <w:rPr>
+          <w:b/>
+          <w:bCs/>
+          <w:sz w:val="28"/>
+          <w:szCs w:val="28"/>
+        </w:rPr>
+      </w:pPr>
+      <w:r>
+        <w:rPr>
+          <w:b/>
+          <w:bCs/>
+          <w:sz w:val="28"/>
+          <w:szCs w:val="28"/>
+        </w:rPr>
+        <w:t xml:space="preserve">        ↓</w:t>
+      </w:r>
+    </w:p>
+    <w:p>
+      <w:pPr>
+        <w:jc w:val="both"/>
+        <w:rPr>
+          <w:b/>
+          <w:bCs/>
+          <w:sz w:val="28"/>
+          <w:szCs w:val="28"/>
+        </w:rPr>
+      </w:pPr>
+      <w:r>
+        <w:rPr>
+          <w:b/>
+          <w:bCs/>
+          <w:sz w:val="28"/>
+          <w:szCs w:val="28"/>
+        </w:rPr>
+        <w:t>Inspect field types</w:t>
+      </w:r>
+    </w:p>
+    <w:p>
+      <w:pPr>
+        <w:jc w:val="both"/>
+        <w:rPr>
+          <w:b/>
+          <w:bCs/>
+          <w:sz w:val="28"/>
+          <w:szCs w:val="28"/>
+        </w:rPr>
+      </w:pPr>
+      <w:r>
+        <w:rPr>
+          <w:b/>
+          <w:bCs/>
+          <w:sz w:val="28"/>
+          <w:szCs w:val="28"/>
+        </w:rPr>
+        <w:t xml:space="preserve">        ↓</w:t>
+      </w:r>
+    </w:p>
+    <w:p>
+      <w:pPr>
+        <w:jc w:val="both"/>
+        <w:rPr>
+          <w:b/>
+          <w:bCs/>
+          <w:sz w:val="28"/>
+          <w:szCs w:val="28"/>
+        </w:rPr>
+      </w:pPr>
+      <w:r>
+        <w:rPr>
+          <w:b/>
+          <w:bCs/>
+          <w:sz w:val="28"/>
+          <w:szCs w:val="28"/>
+        </w:rPr>
+        <w:t>Inspect @JsonKey</w:t>
+      </w:r>
+    </w:p>
+    <w:p>
+      <w:pPr>
+        <w:jc w:val="both"/>
+        <w:rPr>
+          <w:b/>
+          <w:bCs/>
+          <w:sz w:val="28"/>
+          <w:szCs w:val="28"/>
+        </w:rPr>
+      </w:pPr>
+      <w:r>
+        <w:rPr>
+          <w:b/>
+          <w:bCs/>
+          <w:sz w:val="28"/>
+          <w:szCs w:val="28"/>
+        </w:rPr>
+        <w:t xml:space="preserve">        ↓</w:t>
+      </w:r>
+    </w:p>
+    <w:p>
+      <w:pPr>
+        <w:jc w:val="both"/>
+        <w:rPr>
+          <w:b/>
+          <w:bCs/>
+          <w:sz w:val="28"/>
+          <w:szCs w:val="28"/>
+        </w:rPr>
+      </w:pPr>
+      <w:r>
+        <w:rPr>
+          <w:b/>
+          <w:bCs/>
+          <w:sz w:val="28"/>
+          <w:szCs w:val="28"/>
+        </w:rPr>
+        <w:t>Inspect nested classes</w:t>
+      </w:r>
+    </w:p>
+    <w:p>
+      <w:pPr>
+        <w:jc w:val="both"/>
+        <w:rPr>
+          <w:b/>
+          <w:bCs/>
+          <w:sz w:val="28"/>
+          <w:szCs w:val="28"/>
+        </w:rPr>
+      </w:pPr>
+      <w:r>
+        <w:rPr>
+          <w:b/>
+          <w:bCs/>
+          <w:sz w:val="28"/>
+          <w:szCs w:val="28"/>
+        </w:rPr>
+        <w:t xml:space="preserve">        ↓</w:t>
+      </w:r>
+    </w:p>
+    <w:p>
+      <w:pPr>
+        <w:jc w:val="both"/>
+        <w:rPr>
+          <w:b/>
+          <w:bCs/>
+          <w:sz w:val="28"/>
+          <w:szCs w:val="28"/>
+        </w:rPr>
+      </w:pPr>
+      <w:r>
+        <w:rPr>
+          <w:b/>
+          <w:bCs/>
+          <w:sz w:val="28"/>
+          <w:szCs w:val="28"/>
+        </w:rPr>
+        <w:t>Determine JSON conversion</w:t>
+      </w:r>
+    </w:p>
+    <w:p>
+      <w:pPr>
+        <w:jc w:val="both"/>
+        <w:rPr>
+          <w:b/>
+          <w:bCs/>
+          <w:sz w:val="28"/>
+          <w:szCs w:val="28"/>
+        </w:rPr>
+      </w:pPr>
+      <w:r>
+        <w:rPr>
+          <w:b/>
+          <w:bCs/>
+          <w:sz w:val="28"/>
+          <w:szCs w:val="28"/>
+        </w:rPr>
+        <w:t xml:space="preserve">        ↓</w:t>
+      </w:r>
+    </w:p>
+    <w:p>
+      <w:pPr>
+        <w:jc w:val="both"/>
+        <w:rPr>
+          <w:b/>
+          <w:bCs/>
+          <w:sz w:val="28"/>
+          <w:szCs w:val="28"/>
+        </w:rPr>
+      </w:pPr>
+      <w:r>
+        <w:rPr>
+          <w:b/>
+          <w:bCs/>
+          <w:sz w:val="28"/>
+          <w:szCs w:val="28"/>
+        </w:rPr>
+        <w:t>Generate Dart source</w:t>
+      </w:r>
+    </w:p>
+    <w:p>
+      <w:pPr>
+        <w:jc w:val="both"/>
+        <w:rPr>
+          <w:sz w:val="32"/>
+          <w:szCs w:val="32"/>
+        </w:rPr>
+      </w:pPr>
+      <w:r>
+        <w:rPr>
+          <w:sz w:val="32"/>
+          <w:szCs w:val="32"/>
+        </w:rPr>
+        <w:t xml:space="preserve"># </w:t>
+      </w:r>
+      <w:r>
+        <w:rPr>
+          <w:sz w:val="32"/>
+          <w:szCs w:val="32"/>
+        </w:rPr>
+        <w:t>That's why it can generate</w:t>
+      </w:r>
+      <w:r>
+        <w:rPr>
+          <w:b/>
+          <w:bCs/>
+          <w:sz w:val="32"/>
+          <w:szCs w:val="32"/>
+        </w:rPr>
+        <w:t xml:space="preserve"> Movie _$</w:t>
+      </w:r>
+      <w:proofErr w:type="spellStart"/>
+      <w:r>
+        <w:rPr>
+          <w:b/>
+          <w:bCs/>
+          <w:sz w:val="32"/>
+          <w:szCs w:val="32"/>
+        </w:rPr>
+        <w:t>MovieFromJson</w:t>
+      </w:r>
+      <w:proofErr w:type="spellEnd"/>
+      <w:r>
+        <w:rPr>
+          <w:b/>
+          <w:bCs/>
+          <w:sz w:val="32"/>
+          <w:szCs w:val="32"/>
+        </w:rPr>
+        <w:t>(...)</w:t>
+      </w:r>
+      <w:r>
+        <w:rPr>
+          <w:sz w:val="32"/>
+          <w:szCs w:val="32"/>
+        </w:rPr>
+        <w:t xml:space="preserve"> </w:t>
+      </w:r>
+      <w:r>
+        <w:rPr>
+          <w:sz w:val="32"/>
+          <w:szCs w:val="32"/>
+        </w:rPr>
+        <w:t>and</w:t>
+      </w:r>
+      <w:r>
+        <w:rPr>
+          <w:sz w:val="32"/>
+          <w:szCs w:val="32"/>
+        </w:rPr>
+        <w:t xml:space="preserve"> </w:t>
+      </w:r>
+      <w:r>
+        <w:rPr>
+          <w:b/>
+          <w:bCs/>
+          <w:sz w:val="32"/>
+          <w:szCs w:val="32"/>
+        </w:rPr>
+        <w:t>Map&lt;String, dynamic&gt; _$</w:t>
+      </w:r>
+      <w:proofErr w:type="spellStart"/>
+      <w:r>
+        <w:rPr>
+          <w:b/>
+          <w:bCs/>
+          <w:sz w:val="32"/>
+          <w:szCs w:val="32"/>
+        </w:rPr>
+        <w:t>MovieToJson</w:t>
+      </w:r>
+      <w:proofErr w:type="spellEnd"/>
+      <w:r>
+        <w:rPr>
+          <w:b/>
+          <w:bCs/>
+          <w:sz w:val="32"/>
+          <w:szCs w:val="32"/>
+        </w:rPr>
+        <w:t>(...)</w:t>
+      </w:r>
+    </w:p>
+    <w:p>
+      <w:pPr>
+        <w:jc w:val="both"/>
+        <w:rPr>
+          <w:sz w:val="32"/>
+          <w:szCs w:val="32"/>
+        </w:rPr>
+      </w:pPr>
+      <w:r>
+        <w:rPr>
+          <w:sz w:val="32"/>
+          <w:szCs w:val="32"/>
+        </w:rPr>
+        <w:t xml:space="preserve"># </w:t>
+      </w:r>
+      <w:proofErr w:type="spellStart"/>
+      <w:r>
+        <w:rPr>
+          <w:b/>
+          <w:bCs/>
+          <w:sz w:val="32"/>
+          <w:szCs w:val="32"/>
+        </w:rPr>
+        <w:t>source_gen</w:t>
+      </w:r>
+      <w:proofErr w:type="spellEnd"/>
+      <w:r>
+        <w:rPr>
+          <w:sz w:val="32"/>
+          <w:szCs w:val="32"/>
+        </w:rPr>
+        <w:t xml:space="preserve"> explicitly provides </w:t>
+      </w:r>
+      <w:proofErr w:type="spellStart"/>
+      <w:r>
+        <w:rPr>
+          <w:b/>
+          <w:bCs/>
+          <w:sz w:val="32"/>
+          <w:szCs w:val="32"/>
+        </w:rPr>
+        <w:t>GeneratorForAnnotation</w:t>
+      </w:r>
+      <w:proofErr w:type="spellEnd"/>
+      <w:r>
+        <w:rPr>
+          <w:sz w:val="32"/>
+          <w:szCs w:val="32"/>
+        </w:rPr>
+        <w:t xml:space="preserve"> for this style of annotation-driven generation.</w:t>
+      </w:r>
+    </w:p>
+    <w:p>
+      <w:pPr>
+        <w:jc w:val="both"/>
+        <w:rPr>
+          <w:sz w:val="32"/>
+          <w:szCs w:val="32"/>
+        </w:rPr>
+      </w:pPr>
+    </w:p>
+    <w:p>
+      <w:pPr>
+        <w:jc w:val="both"/>
+        <w:rPr>
+          <w:sz w:val="32"/>
+          <w:szCs w:val="32"/>
+        </w:rPr>
+      </w:pPr>
+      <w:r>
+        <w:rPr>
+          <w:sz w:val="32"/>
+          <w:szCs w:val="32"/>
+        </w:rPr>
+        <w:t>Important Concept:</w:t>
+      </w:r>
+    </w:p>
+    <w:p>
+      <w:pPr>
+        <w:jc w:val="both"/>
+        <w:rPr>
+          <w:sz w:val="32"/>
+          <w:szCs w:val="32"/>
+        </w:rPr>
+      </w:pPr>
+      <w:r>
+        <w:rPr>
+          <w:sz w:val="32"/>
+          <w:szCs w:val="32"/>
+        </w:rPr>
+        <w:t># We don’t necessarily</w:t>
+      </w:r>
+      <w:r>
+        <w:rPr>
+          <w:sz w:val="32"/>
+          <w:szCs w:val="32"/>
+        </w:rPr>
+        <w:t xml:space="preserve"> need </w:t>
+      </w:r>
+      <w:proofErr w:type="spellStart"/>
+      <w:r>
+        <w:rPr>
+          <w:b/>
+          <w:bCs/>
+          <w:sz w:val="32"/>
+          <w:szCs w:val="32"/>
+        </w:rPr>
+        <w:t>source_gen</w:t>
+      </w:r>
+      <w:proofErr w:type="spellEnd"/>
+      <w:r>
+        <w:rPr>
+          <w:sz w:val="32"/>
+          <w:szCs w:val="32"/>
+        </w:rPr>
+        <w:t xml:space="preserve">. </w:t>
+      </w:r>
+      <w:r>
+        <w:rPr>
+          <w:sz w:val="32"/>
+          <w:szCs w:val="32"/>
+        </w:rPr>
+        <w:t>This is another important distinction.</w:t>
+      </w:r>
+      <w:r>
+        <w:rPr>
+          <w:b/>
+          <w:bCs/>
+          <w:sz w:val="32"/>
+          <w:szCs w:val="32"/>
+        </w:rPr>
+        <w:t xml:space="preserve"> Dart</w:t>
+      </w:r>
+      <w:r>
+        <w:rPr>
+          <w:sz w:val="32"/>
+          <w:szCs w:val="32"/>
+        </w:rPr>
+        <w:t>'s</w:t>
+      </w:r>
+      <w:r>
+        <w:rPr>
+          <w:b/>
+          <w:bCs/>
+          <w:sz w:val="32"/>
+          <w:szCs w:val="32"/>
+        </w:rPr>
+        <w:t xml:space="preserve"> build </w:t>
+      </w:r>
+      <w:r>
+        <w:rPr>
+          <w:sz w:val="32"/>
+          <w:szCs w:val="32"/>
+        </w:rPr>
+        <w:t xml:space="preserve">package is the lower-level framework for authoring </w:t>
+      </w:r>
+      <w:proofErr w:type="spellStart"/>
+      <w:r>
+        <w:rPr>
+          <w:b/>
+          <w:bCs/>
+          <w:sz w:val="32"/>
+          <w:szCs w:val="32"/>
+        </w:rPr>
+        <w:t>build_runner</w:t>
+      </w:r>
+      <w:proofErr w:type="spellEnd"/>
+      <w:r>
+        <w:rPr>
+          <w:sz w:val="32"/>
+          <w:szCs w:val="32"/>
+        </w:rPr>
+        <w:t>-compatible generators.</w:t>
+      </w:r>
+    </w:p>
+    <w:p>
+      <w:pPr>
+        <w:jc w:val="both"/>
+        <w:rPr>
+          <w:sz w:val="32"/>
+          <w:szCs w:val="32"/>
+        </w:rPr>
+      </w:pPr>
+      <w:r>
+        <w:rPr>
+          <w:sz w:val="32"/>
+          <w:szCs w:val="32"/>
+        </w:rPr>
         <w:lastRenderedPageBreak/>
-        <w:t xml:space="preserve">        ↓</w:t>
-      </w:r>
-    </w:p>
-    <w:p>
-      <w:pPr>
-        <w:jc w:val="both"/>
-        <w:rPr>
-          <w:b/>
-          <w:bCs/>
-          <w:sz w:val="28"/>
-          <w:szCs w:val="28"/>
-        </w:rPr>
-      </w:pPr>
-      <w:r>
-        <w:rPr>
-          <w:b/>
-          <w:bCs/>
-          <w:sz w:val="28"/>
-          <w:szCs w:val="28"/>
-        </w:rPr>
-        <w:t xml:space="preserve">Get </w:t>
-      </w:r>
-      <w:proofErr w:type="spellStart"/>
-      <w:r>
-        <w:rPr>
-          <w:b/>
-          <w:bCs/>
-          <w:sz w:val="28"/>
-          <w:szCs w:val="28"/>
-        </w:rPr>
-        <w:t>ClassElement</w:t>
-      </w:r>
-      <w:proofErr w:type="spellEnd"/>
-    </w:p>
-    <w:p>
-      <w:pPr>
-        <w:jc w:val="both"/>
-        <w:rPr>
-          <w:b/>
-          <w:bCs/>
-          <w:sz w:val="28"/>
-          <w:szCs w:val="28"/>
-        </w:rPr>
-      </w:pPr>
-      <w:r>
-        <w:rPr>
-          <w:b/>
-          <w:bCs/>
-          <w:sz w:val="28"/>
-          <w:szCs w:val="28"/>
-        </w:rPr>
-        <w:t xml:space="preserve">        ↓</w:t>
-      </w:r>
-    </w:p>
-    <w:p>
-      <w:pPr>
-        <w:jc w:val="both"/>
-        <w:rPr>
-          <w:b/>
-          <w:bCs/>
-          <w:sz w:val="28"/>
-          <w:szCs w:val="28"/>
-        </w:rPr>
-      </w:pPr>
-      <w:r>
-        <w:rPr>
-          <w:b/>
-          <w:bCs/>
-          <w:sz w:val="28"/>
-          <w:szCs w:val="28"/>
-        </w:rPr>
-        <w:t>Inspect fields</w:t>
-      </w:r>
-    </w:p>
-    <w:p>
-      <w:pPr>
-        <w:jc w:val="both"/>
-        <w:rPr>
-          <w:b/>
-          <w:bCs/>
-          <w:sz w:val="28"/>
-          <w:szCs w:val="28"/>
-        </w:rPr>
-      </w:pPr>
-      <w:r>
-        <w:rPr>
-          <w:b/>
-          <w:bCs/>
-          <w:sz w:val="28"/>
-          <w:szCs w:val="28"/>
-        </w:rPr>
-        <w:t xml:space="preserve">        ↓</w:t>
-      </w:r>
-    </w:p>
-    <w:p>
-      <w:pPr>
-        <w:jc w:val="both"/>
-        <w:rPr>
-          <w:b/>
-          <w:bCs/>
-          <w:sz w:val="28"/>
-          <w:szCs w:val="28"/>
-        </w:rPr>
-      </w:pPr>
-      <w:r>
-        <w:rPr>
-          <w:b/>
-          <w:bCs/>
-          <w:sz w:val="28"/>
-          <w:szCs w:val="28"/>
-        </w:rPr>
-        <w:t>Inspect field types</w:t>
-      </w:r>
-    </w:p>
-    <w:p>
-      <w:pPr>
-        <w:jc w:val="both"/>
-        <w:rPr>
-          <w:b/>
-          <w:bCs/>
-          <w:sz w:val="28"/>
-          <w:szCs w:val="28"/>
-        </w:rPr>
-      </w:pPr>
-      <w:r>
-        <w:rPr>
-          <w:b/>
-          <w:bCs/>
-          <w:sz w:val="28"/>
-          <w:szCs w:val="28"/>
-        </w:rPr>
-        <w:t xml:space="preserve">        ↓</w:t>
-      </w:r>
-    </w:p>
-    <w:p>
-      <w:pPr>
-        <w:jc w:val="both"/>
-        <w:rPr>
-          <w:b/>
-          <w:bCs/>
-          <w:sz w:val="28"/>
-          <w:szCs w:val="28"/>
-        </w:rPr>
-      </w:pPr>
-      <w:r>
-        <w:rPr>
-          <w:b/>
-          <w:bCs/>
-          <w:sz w:val="28"/>
-          <w:szCs w:val="28"/>
-        </w:rPr>
-        <w:t>Inspect @JsonKey</w:t>
-      </w:r>
-    </w:p>
-    <w:p>
-      <w:pPr>
-        <w:jc w:val="both"/>
-        <w:rPr>
-          <w:b/>
-          <w:bCs/>
-          <w:sz w:val="28"/>
-          <w:szCs w:val="28"/>
-        </w:rPr>
-      </w:pPr>
-      <w:r>
-        <w:rPr>
-          <w:b/>
-          <w:bCs/>
-          <w:sz w:val="28"/>
-          <w:szCs w:val="28"/>
-        </w:rPr>
-        <w:t xml:space="preserve">        ↓</w:t>
-      </w:r>
-    </w:p>
-    <w:p>
-      <w:pPr>
-        <w:jc w:val="both"/>
-        <w:rPr>
-          <w:b/>
-          <w:bCs/>
-          <w:sz w:val="28"/>
-          <w:szCs w:val="28"/>
-        </w:rPr>
-      </w:pPr>
-      <w:r>
-        <w:rPr>
-          <w:b/>
-          <w:bCs/>
-          <w:sz w:val="28"/>
-          <w:szCs w:val="28"/>
-        </w:rPr>
-        <w:t>Inspect nested classes</w:t>
-      </w:r>
-    </w:p>
-    <w:p>
-      <w:pPr>
-        <w:jc w:val="both"/>
-        <w:rPr>
-          <w:b/>
-          <w:bCs/>
-          <w:sz w:val="28"/>
-          <w:szCs w:val="28"/>
-        </w:rPr>
-      </w:pPr>
-      <w:r>
-        <w:rPr>
-          <w:b/>
-          <w:bCs/>
-          <w:sz w:val="28"/>
-          <w:szCs w:val="28"/>
-        </w:rPr>
-        <w:t xml:space="preserve">        ↓</w:t>
-      </w:r>
-    </w:p>
-    <w:p>
-      <w:pPr>
-        <w:jc w:val="both"/>
-        <w:rPr>
-          <w:b/>
-          <w:bCs/>
-          <w:sz w:val="28"/>
-          <w:szCs w:val="28"/>
-        </w:rPr>
-      </w:pPr>
-      <w:r>
-        <w:rPr>
-          <w:b/>
-          <w:bCs/>
-          <w:sz w:val="28"/>
-          <w:szCs w:val="28"/>
-        </w:rPr>
-        <w:t>Determine JSON conversion</w:t>
-      </w:r>
-    </w:p>
-    <w:p>
-      <w:pPr>
-        <w:jc w:val="both"/>
-        <w:rPr>
-          <w:b/>
-          <w:bCs/>
-          <w:sz w:val="28"/>
-          <w:szCs w:val="28"/>
-        </w:rPr>
-      </w:pPr>
-      <w:r>
-        <w:rPr>
-          <w:b/>
-          <w:bCs/>
-          <w:sz w:val="28"/>
-          <w:szCs w:val="28"/>
-        </w:rPr>
-        <w:t xml:space="preserve">        ↓</w:t>
-      </w:r>
-    </w:p>
-    <w:p>
-      <w:pPr>
-        <w:jc w:val="both"/>
-        <w:rPr>
-          <w:b/>
-          <w:bCs/>
-          <w:sz w:val="28"/>
-          <w:szCs w:val="28"/>
-        </w:rPr>
-      </w:pPr>
-      <w:r>
-        <w:rPr>
-          <w:b/>
-          <w:bCs/>
-          <w:sz w:val="28"/>
-          <w:szCs w:val="28"/>
-        </w:rPr>
-        <w:t>Generate Dart source</w:t>
+        <w:t>#</w:t>
+      </w:r>
+      <w:r>
+        <w:rPr>
+          <w:sz w:val="32"/>
+          <w:szCs w:val="32"/>
+        </w:rPr>
+        <w:t xml:space="preserve"> </w:t>
+      </w:r>
+      <w:proofErr w:type="spellStart"/>
+      <w:r>
+        <w:rPr>
+          <w:b/>
+          <w:bCs/>
+          <w:sz w:val="32"/>
+          <w:szCs w:val="32"/>
+        </w:rPr>
+        <w:t>source_gen</w:t>
+      </w:r>
+      <w:proofErr w:type="spellEnd"/>
+      <w:r>
+        <w:rPr>
+          <w:sz w:val="32"/>
+          <w:szCs w:val="32"/>
+        </w:rPr>
+        <w:t xml:space="preserve"> sits on top of it and gives </w:t>
+      </w:r>
+      <w:r>
+        <w:rPr>
+          <w:sz w:val="32"/>
+          <w:szCs w:val="32"/>
+        </w:rPr>
+        <w:t>we</w:t>
+      </w:r>
+      <w:r>
+        <w:rPr>
+          <w:sz w:val="32"/>
+          <w:szCs w:val="32"/>
+        </w:rPr>
+        <w:t xml:space="preserve"> convenient utilities for common source-generation tasks.</w:t>
+      </w:r>
+      <w:r>
+        <w:rPr>
+          <w:sz w:val="32"/>
+          <w:szCs w:val="32"/>
+        </w:rPr>
+        <w:t xml:space="preserve"> </w:t>
+      </w:r>
+      <w:r>
+        <w:rPr>
+          <w:sz w:val="32"/>
+          <w:szCs w:val="32"/>
+        </w:rPr>
+        <w:t>So, there are roughly three levels:</w:t>
+      </w:r>
+    </w:p>
+    <w:p>
+      <w:pPr>
+        <w:jc w:val="both"/>
+        <w:rPr>
+          <w:b/>
+          <w:bCs/>
+          <w:sz w:val="28"/>
+          <w:szCs w:val="28"/>
+        </w:rPr>
+      </w:pPr>
+      <w:proofErr w:type="spellStart"/>
+      <w:r>
+        <w:rPr>
+          <w:b/>
+          <w:bCs/>
+          <w:sz w:val="28"/>
+          <w:szCs w:val="28"/>
+        </w:rPr>
+        <w:t>build_runner</w:t>
+      </w:r>
+      <w:proofErr w:type="spellEnd"/>
+    </w:p>
+    <w:p>
+      <w:pPr>
+        <w:jc w:val="both"/>
+        <w:rPr>
+          <w:b/>
+          <w:bCs/>
+          <w:sz w:val="28"/>
+          <w:szCs w:val="28"/>
+        </w:rPr>
+      </w:pPr>
+      <w:r>
+        <w:rPr>
+          <w:b/>
+          <w:bCs/>
+          <w:sz w:val="28"/>
+          <w:szCs w:val="28"/>
+        </w:rPr>
+        <w:t xml:space="preserve">    ↓</w:t>
+      </w:r>
+    </w:p>
+    <w:p>
+      <w:pPr>
+        <w:jc w:val="both"/>
+        <w:rPr>
+          <w:b/>
+          <w:bCs/>
+          <w:sz w:val="28"/>
+          <w:szCs w:val="28"/>
+        </w:rPr>
+      </w:pPr>
+      <w:r>
+        <w:rPr>
+          <w:b/>
+          <w:bCs/>
+          <w:sz w:val="28"/>
+          <w:szCs w:val="28"/>
+        </w:rPr>
+        <w:t>runs builders</w:t>
+      </w:r>
+    </w:p>
+    <w:p>
+      <w:pPr>
+        <w:jc w:val="both"/>
+        <w:rPr>
+          <w:b/>
+          <w:bCs/>
+          <w:sz w:val="28"/>
+          <w:szCs w:val="28"/>
+        </w:rPr>
+      </w:pPr>
+      <w:r>
+        <w:rPr>
+          <w:b/>
+          <w:bCs/>
+          <w:sz w:val="28"/>
+          <w:szCs w:val="28"/>
+        </w:rPr>
+        <w:t>-------</w:t>
+      </w:r>
+    </w:p>
+    <w:p>
+      <w:pPr>
+        <w:jc w:val="both"/>
+        <w:rPr>
+          <w:b/>
+          <w:bCs/>
+          <w:sz w:val="28"/>
+          <w:szCs w:val="28"/>
+        </w:rPr>
+      </w:pPr>
+      <w:r>
+        <w:rPr>
+          <w:b/>
+          <w:bCs/>
+          <w:sz w:val="28"/>
+          <w:szCs w:val="28"/>
+        </w:rPr>
+        <w:t>build</w:t>
+      </w:r>
+    </w:p>
+    <w:p>
+      <w:pPr>
+        <w:jc w:val="both"/>
+        <w:rPr>
+          <w:b/>
+          <w:bCs/>
+          <w:sz w:val="28"/>
+          <w:szCs w:val="28"/>
+        </w:rPr>
+      </w:pPr>
+      <w:r>
+        <w:rPr>
+          <w:b/>
+          <w:bCs/>
+          <w:sz w:val="28"/>
+          <w:szCs w:val="28"/>
+        </w:rPr>
+        <w:t xml:space="preserve">    ↓</w:t>
+      </w:r>
+    </w:p>
+    <w:p>
+      <w:pPr>
+        <w:jc w:val="both"/>
+        <w:rPr>
+          <w:b/>
+          <w:bCs/>
+          <w:sz w:val="28"/>
+          <w:szCs w:val="28"/>
+        </w:rPr>
+      </w:pPr>
+      <w:r>
+        <w:rPr>
+          <w:b/>
+          <w:bCs/>
+          <w:sz w:val="28"/>
+          <w:szCs w:val="28"/>
+        </w:rPr>
+        <w:t>lower-level API for creating builders</w:t>
+      </w:r>
+    </w:p>
+    <w:p>
+      <w:pPr>
+        <w:jc w:val="both"/>
+        <w:rPr>
+          <w:b/>
+          <w:bCs/>
+          <w:sz w:val="28"/>
+          <w:szCs w:val="28"/>
+        </w:rPr>
+      </w:pPr>
+      <w:r>
+        <w:rPr>
+          <w:b/>
+          <w:bCs/>
+          <w:sz w:val="28"/>
+          <w:szCs w:val="28"/>
+        </w:rPr>
+        <w:t>-------</w:t>
+      </w:r>
+    </w:p>
+    <w:p>
+      <w:pPr>
+        <w:jc w:val="both"/>
+        <w:rPr>
+          <w:b/>
+          <w:bCs/>
+          <w:sz w:val="28"/>
+          <w:szCs w:val="28"/>
+        </w:rPr>
+      </w:pPr>
+      <w:proofErr w:type="spellStart"/>
+      <w:r>
+        <w:rPr>
+          <w:b/>
+          <w:bCs/>
+          <w:sz w:val="28"/>
+          <w:szCs w:val="28"/>
+        </w:rPr>
+        <w:t>source_gen</w:t>
+      </w:r>
+      <w:proofErr w:type="spellEnd"/>
+    </w:p>
+    <w:p>
+      <w:pPr>
+        <w:jc w:val="both"/>
+        <w:rPr>
+          <w:b/>
+          <w:bCs/>
+          <w:sz w:val="28"/>
+          <w:szCs w:val="28"/>
+        </w:rPr>
+      </w:pPr>
+      <w:r>
+        <w:rPr>
+          <w:b/>
+          <w:bCs/>
+          <w:sz w:val="28"/>
+          <w:szCs w:val="28"/>
+        </w:rPr>
+        <w:t xml:space="preserve">    ↓</w:t>
+      </w:r>
+    </w:p>
+    <w:p>
+      <w:pPr>
+        <w:jc w:val="both"/>
+        <w:rPr>
+          <w:b/>
+          <w:bCs/>
+          <w:sz w:val="28"/>
+          <w:szCs w:val="28"/>
+        </w:rPr>
+      </w:pPr>
+      <w:r>
+        <w:rPr>
+          <w:b/>
+          <w:bCs/>
+          <w:sz w:val="28"/>
+          <w:szCs w:val="28"/>
+        </w:rPr>
+        <w:t>higher-level helpers for Dart source generation</w:t>
+      </w:r>
+    </w:p>
+    <w:p>
+      <w:pPr>
+        <w:jc w:val="both"/>
+        <w:rPr>
+          <w:sz w:val="32"/>
+          <w:szCs w:val="32"/>
+        </w:rPr>
+      </w:pPr>
+    </w:p>
+    <w:p>
+      <w:pPr>
+        <w:jc w:val="both"/>
+        <w:rPr>
+          <w:sz w:val="32"/>
+          <w:szCs w:val="32"/>
+        </w:rPr>
+      </w:pPr>
+    </w:p>
+    <w:p>
+      <w:pPr>
+        <w:jc w:val="both"/>
+        <w:rPr>
+          <w:b/>
+          <w:bCs/>
+          <w:sz w:val="32"/>
+          <w:szCs w:val="32"/>
+        </w:rPr>
+      </w:pPr>
+      <w:r>
+        <w:rPr>
+          <w:b/>
+          <w:bCs/>
+          <w:sz w:val="32"/>
+          <w:szCs w:val="32"/>
+        </w:rPr>
+        <w:t>Annotation Arguments in Custom Code Generator:</w:t>
       </w:r>
     </w:p>
     <w:p>
@@ -48535,86 +49200,309 @@
           <w:sz w:val="32"/>
           <w:szCs w:val="32"/>
         </w:rPr>
-        <w:t>That's why it can generate</w:t>
-      </w:r>
-      <w:r>
-        <w:rPr>
-          <w:b/>
-          <w:bCs/>
-          <w:sz w:val="32"/>
-          <w:szCs w:val="32"/>
-        </w:rPr>
-        <w:t xml:space="preserve"> Movie _$</w:t>
-      </w:r>
-      <w:proofErr w:type="spellStart"/>
-      <w:r>
-        <w:rPr>
-          <w:b/>
-          <w:bCs/>
-          <w:sz w:val="32"/>
-          <w:szCs w:val="32"/>
-        </w:rPr>
-        <w:t>MovieFromJson</w:t>
-      </w:r>
-      <w:proofErr w:type="spellEnd"/>
-      <w:r>
-        <w:rPr>
-          <w:b/>
-          <w:bCs/>
-          <w:sz w:val="32"/>
-          <w:szCs w:val="32"/>
-        </w:rPr>
-        <w:t>(...)</w:t>
-      </w:r>
-      <w:r>
-        <w:rPr>
-          <w:sz w:val="32"/>
-          <w:szCs w:val="32"/>
-        </w:rPr>
-        <w:t xml:space="preserve"> </w:t>
-      </w:r>
-      <w:r>
-        <w:rPr>
-          <w:sz w:val="32"/>
-          <w:szCs w:val="32"/>
-        </w:rPr>
-        <w:t>and</w:t>
-      </w:r>
-      <w:r>
-        <w:rPr>
-          <w:sz w:val="32"/>
-          <w:szCs w:val="32"/>
-        </w:rPr>
-        <w:t xml:space="preserve"> </w:t>
-      </w:r>
-      <w:r>
-        <w:rPr>
-          <w:b/>
-          <w:bCs/>
-          <w:sz w:val="32"/>
-          <w:szCs w:val="32"/>
-        </w:rPr>
-        <w:t>Map&lt;String, dynamic&gt; _$</w:t>
-      </w:r>
-      <w:proofErr w:type="spellStart"/>
-      <w:r>
-        <w:rPr>
-          <w:b/>
-          <w:bCs/>
-          <w:sz w:val="32"/>
-          <w:szCs w:val="32"/>
-        </w:rPr>
-        <w:t>MovieToJson</w:t>
-      </w:r>
-      <w:proofErr w:type="spellEnd"/>
-      <w:r>
-        <w:rPr>
-          <w:b/>
-          <w:bCs/>
-          <w:sz w:val="32"/>
-          <w:szCs w:val="32"/>
-        </w:rPr>
-        <w:t>(...)</w:t>
+        <w:t>Instead of:</w:t>
+      </w:r>
+    </w:p>
+    <w:p>
+      <w:pPr>
+        <w:jc w:val="both"/>
+        <w:rPr>
+          <w:b/>
+          <w:bCs/>
+          <w:color w:val="D86DCB" w:themeColor="accent5" w:themeTint="99"/>
+          <w:sz w:val="32"/>
+          <w:szCs w:val="32"/>
+        </w:rPr>
+      </w:pPr>
+      <w:r>
+        <w:rPr>
+          <w:b/>
+          <w:bCs/>
+          <w:color w:val="D86DCB" w:themeColor="accent5" w:themeTint="99"/>
+          <w:sz w:val="32"/>
+          <w:szCs w:val="32"/>
+        </w:rPr>
+        <w:t xml:space="preserve">class </w:t>
+      </w:r>
+      <w:proofErr w:type="spellStart"/>
+      <w:r>
+        <w:rPr>
+          <w:b/>
+          <w:bCs/>
+          <w:color w:val="D86DCB" w:themeColor="accent5" w:themeTint="99"/>
+          <w:sz w:val="32"/>
+          <w:szCs w:val="32"/>
+        </w:rPr>
+        <w:t>GenerateGreeting</w:t>
+      </w:r>
+      <w:proofErr w:type="spellEnd"/>
+      <w:r>
+        <w:rPr>
+          <w:b/>
+          <w:bCs/>
+          <w:color w:val="D86DCB" w:themeColor="accent5" w:themeTint="99"/>
+          <w:sz w:val="32"/>
+          <w:szCs w:val="32"/>
+        </w:rPr>
+        <w:t xml:space="preserve"> {</w:t>
+      </w:r>
+    </w:p>
+    <w:p>
+      <w:pPr>
+        <w:jc w:val="both"/>
+        <w:rPr>
+          <w:b/>
+          <w:bCs/>
+          <w:color w:val="D86DCB" w:themeColor="accent5" w:themeTint="99"/>
+          <w:sz w:val="32"/>
+          <w:szCs w:val="32"/>
+        </w:rPr>
+      </w:pPr>
+      <w:r>
+        <w:rPr>
+          <w:b/>
+          <w:bCs/>
+          <w:color w:val="D86DCB" w:themeColor="accent5" w:themeTint="99"/>
+          <w:sz w:val="32"/>
+          <w:szCs w:val="32"/>
+        </w:rPr>
+        <w:t xml:space="preserve">  const </w:t>
+      </w:r>
+      <w:proofErr w:type="spellStart"/>
+      <w:proofErr w:type="gramStart"/>
+      <w:r>
+        <w:rPr>
+          <w:b/>
+          <w:bCs/>
+          <w:color w:val="D86DCB" w:themeColor="accent5" w:themeTint="99"/>
+          <w:sz w:val="32"/>
+          <w:szCs w:val="32"/>
+        </w:rPr>
+        <w:t>GenerateGreeting</w:t>
+      </w:r>
+      <w:proofErr w:type="spellEnd"/>
+      <w:r>
+        <w:rPr>
+          <w:b/>
+          <w:bCs/>
+          <w:color w:val="D86DCB" w:themeColor="accent5" w:themeTint="99"/>
+          <w:sz w:val="32"/>
+          <w:szCs w:val="32"/>
+        </w:rPr>
+        <w:t>(</w:t>
+      </w:r>
+      <w:proofErr w:type="gramEnd"/>
+      <w:r>
+        <w:rPr>
+          <w:b/>
+          <w:bCs/>
+          <w:color w:val="D86DCB" w:themeColor="accent5" w:themeTint="99"/>
+          <w:sz w:val="32"/>
+          <w:szCs w:val="32"/>
+        </w:rPr>
+        <w:t>);</w:t>
+      </w:r>
+    </w:p>
+    <w:p>
+      <w:pPr>
+        <w:jc w:val="both"/>
+        <w:rPr>
+          <w:b/>
+          <w:bCs/>
+          <w:color w:val="D86DCB" w:themeColor="accent5" w:themeTint="99"/>
+          <w:sz w:val="32"/>
+          <w:szCs w:val="32"/>
+        </w:rPr>
+      </w:pPr>
+      <w:r>
+        <w:rPr>
+          <w:b/>
+          <w:bCs/>
+          <w:color w:val="D86DCB" w:themeColor="accent5" w:themeTint="99"/>
+          <w:sz w:val="32"/>
+          <w:szCs w:val="32"/>
+        </w:rPr>
+        <w:t>}</w:t>
+      </w:r>
+    </w:p>
+    <w:p>
+      <w:pPr>
+        <w:jc w:val="both"/>
+        <w:rPr>
+          <w:sz w:val="32"/>
+          <w:szCs w:val="32"/>
+        </w:rPr>
+      </w:pPr>
+      <w:r>
+        <w:rPr>
+          <w:sz w:val="32"/>
+          <w:szCs w:val="32"/>
+        </w:rPr>
+        <w:t># M</w:t>
+      </w:r>
+      <w:r>
+        <w:rPr>
+          <w:sz w:val="32"/>
+          <w:szCs w:val="32"/>
+        </w:rPr>
+        <w:t>ake it:</w:t>
+      </w:r>
+    </w:p>
+    <w:p>
+      <w:pPr>
+        <w:jc w:val="both"/>
+        <w:rPr>
+          <w:b/>
+          <w:bCs/>
+          <w:color w:val="D86DCB" w:themeColor="accent5" w:themeTint="99"/>
+          <w:sz w:val="32"/>
+          <w:szCs w:val="32"/>
+        </w:rPr>
+      </w:pPr>
+      <w:r>
+        <w:rPr>
+          <w:b/>
+          <w:bCs/>
+          <w:color w:val="D86DCB" w:themeColor="accent5" w:themeTint="99"/>
+          <w:sz w:val="32"/>
+          <w:szCs w:val="32"/>
+        </w:rPr>
+        <w:t xml:space="preserve">class </w:t>
+      </w:r>
+      <w:proofErr w:type="spellStart"/>
+      <w:r>
+        <w:rPr>
+          <w:b/>
+          <w:bCs/>
+          <w:color w:val="D86DCB" w:themeColor="accent5" w:themeTint="99"/>
+          <w:sz w:val="32"/>
+          <w:szCs w:val="32"/>
+        </w:rPr>
+        <w:t>GenerateGreeting</w:t>
+      </w:r>
+      <w:proofErr w:type="spellEnd"/>
+      <w:r>
+        <w:rPr>
+          <w:b/>
+          <w:bCs/>
+          <w:color w:val="D86DCB" w:themeColor="accent5" w:themeTint="99"/>
+          <w:sz w:val="32"/>
+          <w:szCs w:val="32"/>
+        </w:rPr>
+        <w:t xml:space="preserve"> {</w:t>
+      </w:r>
+    </w:p>
+    <w:p>
+      <w:pPr>
+        <w:jc w:val="both"/>
+        <w:rPr>
+          <w:b/>
+          <w:bCs/>
+          <w:color w:val="D86DCB" w:themeColor="accent5" w:themeTint="99"/>
+          <w:sz w:val="32"/>
+          <w:szCs w:val="32"/>
+        </w:rPr>
+      </w:pPr>
+      <w:r>
+        <w:rPr>
+          <w:b/>
+          <w:bCs/>
+          <w:color w:val="D86DCB" w:themeColor="accent5" w:themeTint="99"/>
+          <w:sz w:val="32"/>
+          <w:szCs w:val="32"/>
+        </w:rPr>
+        <w:t xml:space="preserve">  final String greeting;</w:t>
+      </w:r>
+    </w:p>
+    <w:p>
+      <w:pPr>
+        <w:jc w:val="both"/>
+        <w:rPr>
+          <w:b/>
+          <w:bCs/>
+          <w:color w:val="D86DCB" w:themeColor="accent5" w:themeTint="99"/>
+          <w:sz w:val="32"/>
+          <w:szCs w:val="32"/>
+        </w:rPr>
+      </w:pPr>
+      <w:r>
+        <w:rPr>
+          <w:b/>
+          <w:bCs/>
+          <w:color w:val="D86DCB" w:themeColor="accent5" w:themeTint="99"/>
+          <w:sz w:val="32"/>
+          <w:szCs w:val="32"/>
+        </w:rPr>
+        <w:lastRenderedPageBreak/>
+        <w:t xml:space="preserve">  const </w:t>
+      </w:r>
+      <w:proofErr w:type="spellStart"/>
+      <w:r>
+        <w:rPr>
+          <w:b/>
+          <w:bCs/>
+          <w:color w:val="D86DCB" w:themeColor="accent5" w:themeTint="99"/>
+          <w:sz w:val="32"/>
+          <w:szCs w:val="32"/>
+        </w:rPr>
+        <w:t>GenerateGreeting</w:t>
+      </w:r>
+      <w:proofErr w:type="spellEnd"/>
+      <w:r>
+        <w:rPr>
+          <w:b/>
+          <w:bCs/>
+          <w:color w:val="D86DCB" w:themeColor="accent5" w:themeTint="99"/>
+          <w:sz w:val="32"/>
+          <w:szCs w:val="32"/>
+        </w:rPr>
+        <w:t>(</w:t>
+      </w:r>
+      <w:proofErr w:type="spellStart"/>
+      <w:proofErr w:type="gramStart"/>
+      <w:r>
+        <w:rPr>
+          <w:b/>
+          <w:bCs/>
+          <w:color w:val="D86DCB" w:themeColor="accent5" w:themeTint="99"/>
+          <w:sz w:val="32"/>
+          <w:szCs w:val="32"/>
+        </w:rPr>
+        <w:t>this.greeting</w:t>
+      </w:r>
+      <w:proofErr w:type="spellEnd"/>
+      <w:proofErr w:type="gramEnd"/>
+      <w:r>
+        <w:rPr>
+          <w:b/>
+          <w:bCs/>
+          <w:color w:val="D86DCB" w:themeColor="accent5" w:themeTint="99"/>
+          <w:sz w:val="32"/>
+          <w:szCs w:val="32"/>
+        </w:rPr>
+        <w:t>);</w:t>
+      </w:r>
+    </w:p>
+    <w:p>
+      <w:pPr>
+        <w:jc w:val="both"/>
+        <w:rPr>
+          <w:b/>
+          <w:bCs/>
+          <w:color w:val="D86DCB" w:themeColor="accent5" w:themeTint="99"/>
+          <w:sz w:val="32"/>
+          <w:szCs w:val="32"/>
+        </w:rPr>
+      </w:pPr>
+      <w:r>
+        <w:rPr>
+          <w:b/>
+          <w:bCs/>
+          <w:color w:val="D86DCB" w:themeColor="accent5" w:themeTint="99"/>
+          <w:sz w:val="32"/>
+          <w:szCs w:val="32"/>
+        </w:rPr>
+        <w:t>}</w:t>
       </w:r>
     </w:p>
     <w:p>
@@ -48632,205 +49520,12 @@
         </w:rPr>
         <w:t xml:space="preserve"># </w:t>
       </w:r>
-      <w:proofErr w:type="spellStart"/>
-      <w:r>
-        <w:rPr>
-          <w:b/>
-          <w:bCs/>
-          <w:sz w:val="32"/>
-          <w:szCs w:val="32"/>
-        </w:rPr>
-        <w:t>source_gen</w:t>
-      </w:r>
-      <w:proofErr w:type="spellEnd"/>
-      <w:r>
-        <w:rPr>
-          <w:sz w:val="32"/>
-          <w:szCs w:val="32"/>
-        </w:rPr>
-        <w:t xml:space="preserve"> explicitly provides </w:t>
-      </w:r>
-      <w:proofErr w:type="spellStart"/>
-      <w:r>
-        <w:rPr>
-          <w:b/>
-          <w:bCs/>
-          <w:sz w:val="32"/>
-          <w:szCs w:val="32"/>
-        </w:rPr>
-        <w:t>GeneratorForAnnotation</w:t>
-      </w:r>
-      <w:proofErr w:type="spellEnd"/>
-      <w:r>
-        <w:rPr>
-          <w:sz w:val="32"/>
-          <w:szCs w:val="32"/>
-        </w:rPr>
-        <w:t xml:space="preserve"> for this style of annotation-driven generation.</w:t>
-      </w:r>
-    </w:p>
-    <w:p>
-      <w:pPr>
-        <w:jc w:val="both"/>
-        <w:rPr>
-          <w:sz w:val="32"/>
-          <w:szCs w:val="32"/>
-        </w:rPr>
-      </w:pPr>
-    </w:p>
-    <w:p>
-      <w:pPr>
-        <w:jc w:val="both"/>
-        <w:rPr>
-          <w:sz w:val="32"/>
-          <w:szCs w:val="32"/>
-        </w:rPr>
-      </w:pPr>
-      <w:r>
-        <w:rPr>
-          <w:sz w:val="32"/>
-          <w:szCs w:val="32"/>
-        </w:rPr>
-        <w:t>Important Concept:</w:t>
-      </w:r>
-    </w:p>
-    <w:p>
-      <w:pPr>
-        <w:jc w:val="both"/>
-        <w:rPr>
-          <w:sz w:val="32"/>
-          <w:szCs w:val="32"/>
-        </w:rPr>
-      </w:pPr>
-      <w:r>
-        <w:rPr>
-          <w:sz w:val="32"/>
-          <w:szCs w:val="32"/>
-        </w:rPr>
-        <w:t># We don’t necessarily</w:t>
-      </w:r>
-      <w:r>
-        <w:rPr>
-          <w:sz w:val="32"/>
-          <w:szCs w:val="32"/>
-        </w:rPr>
-        <w:t xml:space="preserve"> need </w:t>
-      </w:r>
-      <w:proofErr w:type="spellStart"/>
-      <w:r>
-        <w:rPr>
-          <w:b/>
-          <w:bCs/>
-          <w:sz w:val="32"/>
-          <w:szCs w:val="32"/>
-        </w:rPr>
-        <w:t>source_gen</w:t>
-      </w:r>
-      <w:proofErr w:type="spellEnd"/>
-      <w:r>
-        <w:rPr>
-          <w:sz w:val="32"/>
-          <w:szCs w:val="32"/>
-        </w:rPr>
-        <w:t xml:space="preserve">. </w:t>
-      </w:r>
-      <w:r>
-        <w:rPr>
-          <w:sz w:val="32"/>
-          <w:szCs w:val="32"/>
-        </w:rPr>
-        <w:t>This is another important distinction.</w:t>
-      </w:r>
-      <w:r>
-        <w:rPr>
-          <w:b/>
-          <w:bCs/>
-          <w:sz w:val="32"/>
-          <w:szCs w:val="32"/>
-        </w:rPr>
-        <w:t xml:space="preserve"> Dart</w:t>
-      </w:r>
-      <w:r>
-        <w:rPr>
-          <w:sz w:val="32"/>
-          <w:szCs w:val="32"/>
-        </w:rPr>
-        <w:t>'s</w:t>
-      </w:r>
-      <w:r>
-        <w:rPr>
-          <w:b/>
-          <w:bCs/>
-          <w:sz w:val="32"/>
-          <w:szCs w:val="32"/>
-        </w:rPr>
-        <w:t xml:space="preserve"> build </w:t>
-      </w:r>
-      <w:r>
-        <w:rPr>
-          <w:sz w:val="32"/>
-          <w:szCs w:val="32"/>
-        </w:rPr>
-        <w:t xml:space="preserve">package is the lower-level framework for authoring </w:t>
-      </w:r>
-      <w:proofErr w:type="spellStart"/>
-      <w:r>
-        <w:rPr>
-          <w:b/>
-          <w:bCs/>
-          <w:sz w:val="32"/>
-          <w:szCs w:val="32"/>
-        </w:rPr>
-        <w:t>build_runner</w:t>
-      </w:r>
-      <w:proofErr w:type="spellEnd"/>
-      <w:r>
-        <w:rPr>
-          <w:sz w:val="32"/>
-          <w:szCs w:val="32"/>
-        </w:rPr>
-        <w:t>-compatible generators.</w:t>
-      </w:r>
-    </w:p>
-    <w:p>
-      <w:pPr>
-        <w:jc w:val="both"/>
-        <w:rPr>
-          <w:sz w:val="32"/>
-          <w:szCs w:val="32"/>
-        </w:rPr>
-      </w:pPr>
-      <w:r>
-        <w:rPr>
-          <w:sz w:val="32"/>
-          <w:szCs w:val="32"/>
-        </w:rPr>
-        <w:t>#</w:t>
-      </w:r>
-      <w:r>
-        <w:rPr>
-          <w:sz w:val="32"/>
-          <w:szCs w:val="32"/>
-        </w:rPr>
-        <w:t xml:space="preserve"> </w:t>
-      </w:r>
-      <w:proofErr w:type="spellStart"/>
-      <w:r>
-        <w:rPr>
-          <w:b/>
-          <w:bCs/>
-          <w:sz w:val="32"/>
-          <w:szCs w:val="32"/>
-        </w:rPr>
-        <w:t>source_gen</w:t>
-      </w:r>
-      <w:proofErr w:type="spellEnd"/>
-      <w:r>
-        <w:rPr>
-          <w:sz w:val="32"/>
-          <w:szCs w:val="32"/>
-        </w:rPr>
-        <w:t xml:space="preserve"> sits on top of it and gives </w:t>
+      <w:r>
+        <w:rPr>
+          <w:sz w:val="32"/>
+          <w:szCs w:val="32"/>
+        </w:rPr>
+        <w:t xml:space="preserve">Now </w:t>
       </w:r>
       <w:r>
         <w:rPr>
@@ -48844,644 +49539,6 @@
           <w:sz w:val="32"/>
           <w:szCs w:val="32"/>
         </w:rPr>
-        <w:t xml:space="preserve"> convenient utilities for common source-generation tasks.</w:t>
-      </w:r>
-      <w:r>
-        <w:rPr>
-          <w:sz w:val="32"/>
-          <w:szCs w:val="32"/>
-        </w:rPr>
-        <w:t xml:space="preserve"> </w:t>
-      </w:r>
-      <w:r>
-        <w:rPr>
-          <w:sz w:val="32"/>
-          <w:szCs w:val="32"/>
-        </w:rPr>
-        <w:t>So, there are roughly three levels:</w:t>
-      </w:r>
-    </w:p>
-    <w:p>
-      <w:pPr>
-        <w:jc w:val="both"/>
-        <w:rPr>
-          <w:b/>
-          <w:bCs/>
-          <w:sz w:val="28"/>
-          <w:szCs w:val="28"/>
-        </w:rPr>
-      </w:pPr>
-      <w:proofErr w:type="spellStart"/>
-      <w:r>
-        <w:rPr>
-          <w:b/>
-          <w:bCs/>
-          <w:sz w:val="28"/>
-          <w:szCs w:val="28"/>
-        </w:rPr>
-        <w:lastRenderedPageBreak/>
-        <w:t>build_runner</w:t>
-      </w:r>
-      <w:proofErr w:type="spellEnd"/>
-    </w:p>
-    <w:p>
-      <w:pPr>
-        <w:jc w:val="both"/>
-        <w:rPr>
-          <w:b/>
-          <w:bCs/>
-          <w:sz w:val="28"/>
-          <w:szCs w:val="28"/>
-        </w:rPr>
-      </w:pPr>
-      <w:r>
-        <w:rPr>
-          <w:b/>
-          <w:bCs/>
-          <w:sz w:val="28"/>
-          <w:szCs w:val="28"/>
-        </w:rPr>
-        <w:t xml:space="preserve">    ↓</w:t>
-      </w:r>
-    </w:p>
-    <w:p>
-      <w:pPr>
-        <w:jc w:val="both"/>
-        <w:rPr>
-          <w:b/>
-          <w:bCs/>
-          <w:sz w:val="28"/>
-          <w:szCs w:val="28"/>
-        </w:rPr>
-      </w:pPr>
-      <w:r>
-        <w:rPr>
-          <w:b/>
-          <w:bCs/>
-          <w:sz w:val="28"/>
-          <w:szCs w:val="28"/>
-        </w:rPr>
-        <w:t>runs builders</w:t>
-      </w:r>
-    </w:p>
-    <w:p>
-      <w:pPr>
-        <w:jc w:val="both"/>
-        <w:rPr>
-          <w:b/>
-          <w:bCs/>
-          <w:sz w:val="28"/>
-          <w:szCs w:val="28"/>
-        </w:rPr>
-      </w:pPr>
-      <w:r>
-        <w:rPr>
-          <w:b/>
-          <w:bCs/>
-          <w:sz w:val="28"/>
-          <w:szCs w:val="28"/>
-        </w:rPr>
-        <w:t>-------</w:t>
-      </w:r>
-    </w:p>
-    <w:p>
-      <w:pPr>
-        <w:jc w:val="both"/>
-        <w:rPr>
-          <w:b/>
-          <w:bCs/>
-          <w:sz w:val="28"/>
-          <w:szCs w:val="28"/>
-        </w:rPr>
-      </w:pPr>
-      <w:r>
-        <w:rPr>
-          <w:b/>
-          <w:bCs/>
-          <w:sz w:val="28"/>
-          <w:szCs w:val="28"/>
-        </w:rPr>
-        <w:t>build</w:t>
-      </w:r>
-    </w:p>
-    <w:p>
-      <w:pPr>
-        <w:jc w:val="both"/>
-        <w:rPr>
-          <w:b/>
-          <w:bCs/>
-          <w:sz w:val="28"/>
-          <w:szCs w:val="28"/>
-        </w:rPr>
-      </w:pPr>
-      <w:r>
-        <w:rPr>
-          <w:b/>
-          <w:bCs/>
-          <w:sz w:val="28"/>
-          <w:szCs w:val="28"/>
-        </w:rPr>
-        <w:t xml:space="preserve">    ↓</w:t>
-      </w:r>
-    </w:p>
-    <w:p>
-      <w:pPr>
-        <w:jc w:val="both"/>
-        <w:rPr>
-          <w:b/>
-          <w:bCs/>
-          <w:sz w:val="28"/>
-          <w:szCs w:val="28"/>
-        </w:rPr>
-      </w:pPr>
-      <w:r>
-        <w:rPr>
-          <w:b/>
-          <w:bCs/>
-          <w:sz w:val="28"/>
-          <w:szCs w:val="28"/>
-        </w:rPr>
-        <w:t>lower-level API for creating builders</w:t>
-      </w:r>
-    </w:p>
-    <w:p>
-      <w:pPr>
-        <w:jc w:val="both"/>
-        <w:rPr>
-          <w:b/>
-          <w:bCs/>
-          <w:sz w:val="28"/>
-          <w:szCs w:val="28"/>
-        </w:rPr>
-      </w:pPr>
-      <w:r>
-        <w:rPr>
-          <w:b/>
-          <w:bCs/>
-          <w:sz w:val="28"/>
-          <w:szCs w:val="28"/>
-        </w:rPr>
-        <w:t>-------</w:t>
-      </w:r>
-    </w:p>
-    <w:p>
-      <w:pPr>
-        <w:jc w:val="both"/>
-        <w:rPr>
-          <w:b/>
-          <w:bCs/>
-          <w:sz w:val="28"/>
-          <w:szCs w:val="28"/>
-        </w:rPr>
-      </w:pPr>
-      <w:proofErr w:type="spellStart"/>
-      <w:r>
-        <w:rPr>
-          <w:b/>
-          <w:bCs/>
-          <w:sz w:val="28"/>
-          <w:szCs w:val="28"/>
-        </w:rPr>
-        <w:t>source_gen</w:t>
-      </w:r>
-      <w:proofErr w:type="spellEnd"/>
-    </w:p>
-    <w:p>
-      <w:pPr>
-        <w:jc w:val="both"/>
-        <w:rPr>
-          <w:b/>
-          <w:bCs/>
-          <w:sz w:val="28"/>
-          <w:szCs w:val="28"/>
-        </w:rPr>
-      </w:pPr>
-      <w:r>
-        <w:rPr>
-          <w:b/>
-          <w:bCs/>
-          <w:sz w:val="28"/>
-          <w:szCs w:val="28"/>
-        </w:rPr>
-        <w:t xml:space="preserve">    ↓</w:t>
-      </w:r>
-    </w:p>
-    <w:p>
-      <w:pPr>
-        <w:jc w:val="both"/>
-        <w:rPr>
-          <w:b/>
-          <w:bCs/>
-          <w:sz w:val="28"/>
-          <w:szCs w:val="28"/>
-        </w:rPr>
-      </w:pPr>
-      <w:r>
-        <w:rPr>
-          <w:b/>
-          <w:bCs/>
-          <w:sz w:val="28"/>
-          <w:szCs w:val="28"/>
-        </w:rPr>
-        <w:t>higher-level helpers for Dart source generation</w:t>
-      </w:r>
-    </w:p>
-    <w:p>
-      <w:pPr>
-        <w:jc w:val="both"/>
-        <w:rPr>
-          <w:sz w:val="32"/>
-          <w:szCs w:val="32"/>
-        </w:rPr>
-      </w:pPr>
-    </w:p>
-    <w:p>
-      <w:pPr>
-        <w:jc w:val="both"/>
-        <w:rPr>
-          <w:sz w:val="32"/>
-          <w:szCs w:val="32"/>
-        </w:rPr>
-      </w:pPr>
-    </w:p>
-    <w:p>
-      <w:pPr>
-        <w:jc w:val="both"/>
-        <w:rPr>
-          <w:b/>
-          <w:bCs/>
-          <w:sz w:val="32"/>
-          <w:szCs w:val="32"/>
-        </w:rPr>
-      </w:pPr>
-      <w:r>
-        <w:rPr>
-          <w:b/>
-          <w:bCs/>
-          <w:sz w:val="32"/>
-          <w:szCs w:val="32"/>
-        </w:rPr>
-        <w:t>Annotation Arguments in Custom Code Generator:</w:t>
-      </w:r>
-    </w:p>
-    <w:p>
-      <w:pPr>
-        <w:jc w:val="both"/>
-        <w:rPr>
-          <w:sz w:val="32"/>
-          <w:szCs w:val="32"/>
-        </w:rPr>
-      </w:pPr>
-      <w:r>
-        <w:rPr>
-          <w:sz w:val="32"/>
-          <w:szCs w:val="32"/>
-        </w:rPr>
-        <w:t xml:space="preserve"># </w:t>
-      </w:r>
-      <w:r>
-        <w:rPr>
-          <w:sz w:val="32"/>
-          <w:szCs w:val="32"/>
-        </w:rPr>
-        <w:t>Instead of:</w:t>
-      </w:r>
-    </w:p>
-    <w:p>
-      <w:pPr>
-        <w:jc w:val="both"/>
-        <w:rPr>
-          <w:b/>
-          <w:bCs/>
-          <w:color w:val="D86DCB" w:themeColor="accent5" w:themeTint="99"/>
-          <w:sz w:val="32"/>
-          <w:szCs w:val="32"/>
-        </w:rPr>
-      </w:pPr>
-      <w:r>
-        <w:rPr>
-          <w:b/>
-          <w:bCs/>
-          <w:color w:val="D86DCB" w:themeColor="accent5" w:themeTint="99"/>
-          <w:sz w:val="32"/>
-          <w:szCs w:val="32"/>
-        </w:rPr>
-        <w:t xml:space="preserve">class </w:t>
-      </w:r>
-      <w:proofErr w:type="spellStart"/>
-      <w:r>
-        <w:rPr>
-          <w:b/>
-          <w:bCs/>
-          <w:color w:val="D86DCB" w:themeColor="accent5" w:themeTint="99"/>
-          <w:sz w:val="32"/>
-          <w:szCs w:val="32"/>
-        </w:rPr>
-        <w:t>GenerateGreeting</w:t>
-      </w:r>
-      <w:proofErr w:type="spellEnd"/>
-      <w:r>
-        <w:rPr>
-          <w:b/>
-          <w:bCs/>
-          <w:color w:val="D86DCB" w:themeColor="accent5" w:themeTint="99"/>
-          <w:sz w:val="32"/>
-          <w:szCs w:val="32"/>
-        </w:rPr>
-        <w:t xml:space="preserve"> {</w:t>
-      </w:r>
-    </w:p>
-    <w:p>
-      <w:pPr>
-        <w:jc w:val="both"/>
-        <w:rPr>
-          <w:b/>
-          <w:bCs/>
-          <w:color w:val="D86DCB" w:themeColor="accent5" w:themeTint="99"/>
-          <w:sz w:val="32"/>
-          <w:szCs w:val="32"/>
-        </w:rPr>
-      </w:pPr>
-      <w:r>
-        <w:rPr>
-          <w:b/>
-          <w:bCs/>
-          <w:color w:val="D86DCB" w:themeColor="accent5" w:themeTint="99"/>
-          <w:sz w:val="32"/>
-          <w:szCs w:val="32"/>
-        </w:rPr>
-        <w:t xml:space="preserve">  const </w:t>
-      </w:r>
-      <w:proofErr w:type="spellStart"/>
-      <w:proofErr w:type="gramStart"/>
-      <w:r>
-        <w:rPr>
-          <w:b/>
-          <w:bCs/>
-          <w:color w:val="D86DCB" w:themeColor="accent5" w:themeTint="99"/>
-          <w:sz w:val="32"/>
-          <w:szCs w:val="32"/>
-        </w:rPr>
-        <w:t>GenerateGreeting</w:t>
-      </w:r>
-      <w:proofErr w:type="spellEnd"/>
-      <w:r>
-        <w:rPr>
-          <w:b/>
-          <w:bCs/>
-          <w:color w:val="D86DCB" w:themeColor="accent5" w:themeTint="99"/>
-          <w:sz w:val="32"/>
-          <w:szCs w:val="32"/>
-        </w:rPr>
-        <w:t>(</w:t>
-      </w:r>
-      <w:proofErr w:type="gramEnd"/>
-      <w:r>
-        <w:rPr>
-          <w:b/>
-          <w:bCs/>
-          <w:color w:val="D86DCB" w:themeColor="accent5" w:themeTint="99"/>
-          <w:sz w:val="32"/>
-          <w:szCs w:val="32"/>
-        </w:rPr>
-        <w:t>);</w:t>
-      </w:r>
-    </w:p>
-    <w:p>
-      <w:pPr>
-        <w:jc w:val="both"/>
-        <w:rPr>
-          <w:b/>
-          <w:bCs/>
-          <w:color w:val="D86DCB" w:themeColor="accent5" w:themeTint="99"/>
-          <w:sz w:val="32"/>
-          <w:szCs w:val="32"/>
-        </w:rPr>
-      </w:pPr>
-      <w:r>
-        <w:rPr>
-          <w:b/>
-          <w:bCs/>
-          <w:color w:val="D86DCB" w:themeColor="accent5" w:themeTint="99"/>
-          <w:sz w:val="32"/>
-          <w:szCs w:val="32"/>
-        </w:rPr>
-        <w:t>}</w:t>
-      </w:r>
-    </w:p>
-    <w:p>
-      <w:pPr>
-        <w:jc w:val="both"/>
-        <w:rPr>
-          <w:sz w:val="32"/>
-          <w:szCs w:val="32"/>
-        </w:rPr>
-      </w:pPr>
-      <w:r>
-        <w:rPr>
-          <w:sz w:val="32"/>
-          <w:szCs w:val="32"/>
-        </w:rPr>
-        <w:t># M</w:t>
-      </w:r>
-      <w:r>
-        <w:rPr>
-          <w:sz w:val="32"/>
-          <w:szCs w:val="32"/>
-        </w:rPr>
-        <w:t>ake it:</w:t>
-      </w:r>
-    </w:p>
-    <w:p>
-      <w:pPr>
-        <w:jc w:val="both"/>
-        <w:rPr>
-          <w:b/>
-          <w:bCs/>
-          <w:color w:val="D86DCB" w:themeColor="accent5" w:themeTint="99"/>
-          <w:sz w:val="32"/>
-          <w:szCs w:val="32"/>
-        </w:rPr>
-      </w:pPr>
-      <w:r>
-        <w:rPr>
-          <w:b/>
-          <w:bCs/>
-          <w:color w:val="D86DCB" w:themeColor="accent5" w:themeTint="99"/>
-          <w:sz w:val="32"/>
-          <w:szCs w:val="32"/>
-        </w:rPr>
-        <w:t xml:space="preserve">class </w:t>
-      </w:r>
-      <w:proofErr w:type="spellStart"/>
-      <w:r>
-        <w:rPr>
-          <w:b/>
-          <w:bCs/>
-          <w:color w:val="D86DCB" w:themeColor="accent5" w:themeTint="99"/>
-          <w:sz w:val="32"/>
-          <w:szCs w:val="32"/>
-        </w:rPr>
-        <w:t>GenerateGreeting</w:t>
-      </w:r>
-      <w:proofErr w:type="spellEnd"/>
-      <w:r>
-        <w:rPr>
-          <w:b/>
-          <w:bCs/>
-          <w:color w:val="D86DCB" w:themeColor="accent5" w:themeTint="99"/>
-          <w:sz w:val="32"/>
-          <w:szCs w:val="32"/>
-        </w:rPr>
-        <w:t xml:space="preserve"> {</w:t>
-      </w:r>
-    </w:p>
-    <w:p>
-      <w:pPr>
-        <w:jc w:val="both"/>
-        <w:rPr>
-          <w:b/>
-          <w:bCs/>
-          <w:color w:val="D86DCB" w:themeColor="accent5" w:themeTint="99"/>
-          <w:sz w:val="32"/>
-          <w:szCs w:val="32"/>
-        </w:rPr>
-      </w:pPr>
-      <w:r>
-        <w:rPr>
-          <w:b/>
-          <w:bCs/>
-          <w:color w:val="D86DCB" w:themeColor="accent5" w:themeTint="99"/>
-          <w:sz w:val="32"/>
-          <w:szCs w:val="32"/>
-        </w:rPr>
-        <w:t xml:space="preserve">  final String greeting;</w:t>
-      </w:r>
-    </w:p>
-    <w:p>
-      <w:pPr>
-        <w:jc w:val="both"/>
-        <w:rPr>
-          <w:b/>
-          <w:bCs/>
-          <w:color w:val="D86DCB" w:themeColor="accent5" w:themeTint="99"/>
-          <w:sz w:val="32"/>
-          <w:szCs w:val="32"/>
-        </w:rPr>
-      </w:pPr>
-      <w:r>
-        <w:rPr>
-          <w:b/>
-          <w:bCs/>
-          <w:color w:val="D86DCB" w:themeColor="accent5" w:themeTint="99"/>
-          <w:sz w:val="32"/>
-          <w:szCs w:val="32"/>
-        </w:rPr>
-        <w:t xml:space="preserve">  const </w:t>
-      </w:r>
-      <w:proofErr w:type="spellStart"/>
-      <w:r>
-        <w:rPr>
-          <w:b/>
-          <w:bCs/>
-          <w:color w:val="D86DCB" w:themeColor="accent5" w:themeTint="99"/>
-          <w:sz w:val="32"/>
-          <w:szCs w:val="32"/>
-        </w:rPr>
-        <w:t>GenerateGreeting</w:t>
-      </w:r>
-      <w:proofErr w:type="spellEnd"/>
-      <w:r>
-        <w:rPr>
-          <w:b/>
-          <w:bCs/>
-          <w:color w:val="D86DCB" w:themeColor="accent5" w:themeTint="99"/>
-          <w:sz w:val="32"/>
-          <w:szCs w:val="32"/>
-        </w:rPr>
-        <w:t>(</w:t>
-      </w:r>
-      <w:proofErr w:type="spellStart"/>
-      <w:proofErr w:type="gramStart"/>
-      <w:r>
-        <w:rPr>
-          <w:b/>
-          <w:bCs/>
-          <w:color w:val="D86DCB" w:themeColor="accent5" w:themeTint="99"/>
-          <w:sz w:val="32"/>
-          <w:szCs w:val="32"/>
-        </w:rPr>
-        <w:t>this.greeting</w:t>
-      </w:r>
-      <w:proofErr w:type="spellEnd"/>
-      <w:proofErr w:type="gramEnd"/>
-      <w:r>
-        <w:rPr>
-          <w:b/>
-          <w:bCs/>
-          <w:color w:val="D86DCB" w:themeColor="accent5" w:themeTint="99"/>
-          <w:sz w:val="32"/>
-          <w:szCs w:val="32"/>
-        </w:rPr>
-        <w:t>);</w:t>
-      </w:r>
-    </w:p>
-    <w:p>
-      <w:pPr>
-        <w:jc w:val="both"/>
-        <w:rPr>
-          <w:b/>
-          <w:bCs/>
-          <w:color w:val="D86DCB" w:themeColor="accent5" w:themeTint="99"/>
-          <w:sz w:val="32"/>
-          <w:szCs w:val="32"/>
-        </w:rPr>
-      </w:pPr>
-      <w:r>
-        <w:rPr>
-          <w:b/>
-          <w:bCs/>
-          <w:color w:val="D86DCB" w:themeColor="accent5" w:themeTint="99"/>
-          <w:sz w:val="32"/>
-          <w:szCs w:val="32"/>
-        </w:rPr>
-        <w:t>}</w:t>
-      </w:r>
-    </w:p>
-    <w:p>
-      <w:pPr>
-        <w:jc w:val="both"/>
-        <w:rPr>
-          <w:sz w:val="32"/>
-          <w:szCs w:val="32"/>
-        </w:rPr>
-      </w:pPr>
-      <w:r>
-        <w:rPr>
-          <w:sz w:val="32"/>
-          <w:szCs w:val="32"/>
-        </w:rPr>
-        <w:t xml:space="preserve"># </w:t>
-      </w:r>
-      <w:r>
-        <w:rPr>
-          <w:sz w:val="32"/>
-          <w:szCs w:val="32"/>
-        </w:rPr>
-        <w:t xml:space="preserve">Now </w:t>
-      </w:r>
-      <w:r>
-        <w:rPr>
-          <w:sz w:val="32"/>
-          <w:szCs w:val="32"/>
-        </w:rPr>
-        <w:t>we</w:t>
-      </w:r>
-      <w:r>
-        <w:rPr>
-          <w:sz w:val="32"/>
-          <w:szCs w:val="32"/>
-        </w:rPr>
         <w:t xml:space="preserve"> can write:</w:t>
       </w:r>
     </w:p>
@@ -49504,7 +49561,6 @@
           <w:sz w:val="32"/>
           <w:szCs w:val="32"/>
         </w:rPr>
-        <w:lastRenderedPageBreak/>
         <w:t>@GenerateGreeting('Hello')</w:t>
       </w:r>
     </w:p>
@@ -50330,6 +50386,7 @@
           <w:sz w:val="32"/>
           <w:szCs w:val="32"/>
         </w:rPr>
+        <w:lastRenderedPageBreak/>
         <w:t xml:space="preserve">  ) {</w:t>
       </w:r>
     </w:p>
@@ -50432,30 +50489,606 @@
           <w:sz w:val="32"/>
           <w:szCs w:val="32"/>
         </w:rPr>
+        <w:t xml:space="preserve">    return '''</w:t>
+      </w:r>
+    </w:p>
+    <w:p>
+      <w:pPr>
+        <w:jc w:val="both"/>
+        <w:rPr>
+          <w:b/>
+          <w:bCs/>
+          <w:color w:val="D86DCB" w:themeColor="accent5" w:themeTint="99"/>
+          <w:sz w:val="32"/>
+          <w:szCs w:val="32"/>
+        </w:rPr>
+      </w:pPr>
+      <w:r>
+        <w:rPr>
+          <w:b/>
+          <w:bCs/>
+          <w:color w:val="D86DCB" w:themeColor="accent5" w:themeTint="99"/>
+          <w:sz w:val="32"/>
+          <w:szCs w:val="32"/>
+        </w:rPr>
+        <w:t>extension ${</w:t>
+      </w:r>
+      <w:proofErr w:type="gramStart"/>
+      <w:r>
+        <w:rPr>
+          <w:b/>
+          <w:bCs/>
+          <w:color w:val="D86DCB" w:themeColor="accent5" w:themeTint="99"/>
+          <w:sz w:val="32"/>
+          <w:szCs w:val="32"/>
+        </w:rPr>
+        <w:t>element.name}Greeting</w:t>
+      </w:r>
+      <w:proofErr w:type="gramEnd"/>
+      <w:r>
+        <w:rPr>
+          <w:b/>
+          <w:bCs/>
+          <w:color w:val="D86DCB" w:themeColor="accent5" w:themeTint="99"/>
+          <w:sz w:val="32"/>
+          <w:szCs w:val="32"/>
+        </w:rPr>
+        <w:t xml:space="preserve"> on ${element.name} {</w:t>
+      </w:r>
+    </w:p>
+    <w:p>
+      <w:pPr>
+        <w:jc w:val="both"/>
+        <w:rPr>
+          <w:b/>
+          <w:bCs/>
+          <w:color w:val="D86DCB" w:themeColor="accent5" w:themeTint="99"/>
+          <w:sz w:val="32"/>
+          <w:szCs w:val="32"/>
+        </w:rPr>
+      </w:pPr>
+      <w:r>
+        <w:rPr>
+          <w:b/>
+          <w:bCs/>
+          <w:color w:val="D86DCB" w:themeColor="accent5" w:themeTint="99"/>
+          <w:sz w:val="32"/>
+          <w:szCs w:val="32"/>
+        </w:rPr>
+        <w:t xml:space="preserve">  String </w:t>
+      </w:r>
+      <w:proofErr w:type="gramStart"/>
+      <w:r>
+        <w:rPr>
+          <w:b/>
+          <w:bCs/>
+          <w:color w:val="D86DCB" w:themeColor="accent5" w:themeTint="99"/>
+          <w:sz w:val="32"/>
+          <w:szCs w:val="32"/>
+        </w:rPr>
+        <w:t>greeting(</w:t>
+      </w:r>
+      <w:proofErr w:type="gramEnd"/>
+      <w:r>
+        <w:rPr>
+          <w:b/>
+          <w:bCs/>
+          <w:color w:val="D86DCB" w:themeColor="accent5" w:themeTint="99"/>
+          <w:sz w:val="32"/>
+          <w:szCs w:val="32"/>
+        </w:rPr>
+        <w:t>) =&gt; '$greeting, \$name!';</w:t>
+      </w:r>
+    </w:p>
+    <w:p>
+      <w:pPr>
+        <w:jc w:val="both"/>
+        <w:rPr>
+          <w:b/>
+          <w:bCs/>
+          <w:color w:val="D86DCB" w:themeColor="accent5" w:themeTint="99"/>
+          <w:sz w:val="32"/>
+          <w:szCs w:val="32"/>
+        </w:rPr>
+      </w:pPr>
+      <w:r>
+        <w:rPr>
+          <w:b/>
+          <w:bCs/>
+          <w:color w:val="D86DCB" w:themeColor="accent5" w:themeTint="99"/>
+          <w:sz w:val="32"/>
+          <w:szCs w:val="32"/>
+        </w:rPr>
+        <w:t>}</w:t>
+      </w:r>
+    </w:p>
+    <w:p>
+      <w:pPr>
+        <w:jc w:val="both"/>
+        <w:rPr>
+          <w:b/>
+          <w:bCs/>
+          <w:color w:val="D86DCB" w:themeColor="accent5" w:themeTint="99"/>
+          <w:sz w:val="32"/>
+          <w:szCs w:val="32"/>
+        </w:rPr>
+      </w:pPr>
+      <w:r>
+        <w:rPr>
+          <w:b/>
+          <w:bCs/>
+          <w:color w:val="D86DCB" w:themeColor="accent5" w:themeTint="99"/>
+          <w:sz w:val="32"/>
+          <w:szCs w:val="32"/>
+        </w:rPr>
+        <w:t>''';</w:t>
+      </w:r>
+    </w:p>
+    <w:p>
+      <w:pPr>
+        <w:jc w:val="both"/>
+        <w:rPr>
+          <w:b/>
+          <w:bCs/>
+          <w:color w:val="D86DCB" w:themeColor="accent5" w:themeTint="99"/>
+          <w:sz w:val="32"/>
+          <w:szCs w:val="32"/>
+        </w:rPr>
+      </w:pPr>
+      <w:r>
+        <w:rPr>
+          <w:b/>
+          <w:bCs/>
+          <w:color w:val="D86DCB" w:themeColor="accent5" w:themeTint="99"/>
+          <w:sz w:val="32"/>
+          <w:szCs w:val="32"/>
+        </w:rPr>
+        <w:t xml:space="preserve">  }</w:t>
+      </w:r>
+    </w:p>
+    <w:p>
+      <w:pPr>
+        <w:jc w:val="both"/>
+        <w:rPr>
+          <w:b/>
+          <w:bCs/>
+          <w:color w:val="D86DCB" w:themeColor="accent5" w:themeTint="99"/>
+          <w:sz w:val="32"/>
+          <w:szCs w:val="32"/>
+        </w:rPr>
+      </w:pPr>
+      <w:r>
+        <w:rPr>
+          <w:b/>
+          <w:bCs/>
+          <w:color w:val="D86DCB" w:themeColor="accent5" w:themeTint="99"/>
+          <w:sz w:val="32"/>
+          <w:szCs w:val="32"/>
+        </w:rPr>
+        <w:t>}</w:t>
+      </w:r>
+    </w:p>
+    <w:p>
+      <w:pPr>
+        <w:jc w:val="both"/>
+        <w:rPr>
+          <w:sz w:val="32"/>
+          <w:szCs w:val="32"/>
+        </w:rPr>
+      </w:pPr>
+      <w:r>
+        <w:rPr>
+          <w:sz w:val="32"/>
+          <w:szCs w:val="32"/>
+        </w:rPr>
+        <w:t xml:space="preserve"># </w:t>
+      </w:r>
+      <w:r>
+        <w:rPr>
+          <w:sz w:val="32"/>
+          <w:szCs w:val="32"/>
+        </w:rPr>
+        <w:t>So</w:t>
+      </w:r>
+      <w:r>
+        <w:rPr>
+          <w:sz w:val="32"/>
+          <w:szCs w:val="32"/>
+        </w:rPr>
+        <w:t xml:space="preserve">, </w:t>
+      </w:r>
+      <w:r>
+        <w:rPr>
+          <w:b/>
+          <w:bCs/>
+          <w:sz w:val="32"/>
+          <w:szCs w:val="32"/>
+        </w:rPr>
+        <w:t xml:space="preserve">@GenerateGreeting('Hello') </w:t>
+      </w:r>
+      <w:r>
+        <w:rPr>
+          <w:sz w:val="32"/>
+          <w:szCs w:val="32"/>
+        </w:rPr>
+        <w:t>becomes:</w:t>
+      </w:r>
+    </w:p>
+    <w:p>
+      <w:pPr>
+        <w:jc w:val="both"/>
+        <w:rPr>
+          <w:b/>
+          <w:bCs/>
+          <w:sz w:val="28"/>
+          <w:szCs w:val="28"/>
+        </w:rPr>
+      </w:pPr>
+      <w:r>
+        <w:rPr>
+          <w:b/>
+          <w:bCs/>
+          <w:sz w:val="28"/>
+          <w:szCs w:val="28"/>
+        </w:rPr>
+        <w:t>annotation</w:t>
+      </w:r>
+    </w:p>
+    <w:p>
+      <w:pPr>
+        <w:jc w:val="both"/>
+        <w:rPr>
+          <w:b/>
+          <w:bCs/>
+          <w:sz w:val="28"/>
+          <w:szCs w:val="28"/>
+        </w:rPr>
+      </w:pPr>
+      <w:r>
+        <w:rPr>
+          <w:b/>
+          <w:bCs/>
+          <w:sz w:val="28"/>
+          <w:szCs w:val="28"/>
+        </w:rPr>
+        <w:t xml:space="preserve">   ↓</w:t>
+      </w:r>
+    </w:p>
+    <w:p>
+      <w:pPr>
+        <w:jc w:val="both"/>
+        <w:rPr>
+          <w:b/>
+          <w:bCs/>
+          <w:sz w:val="28"/>
+          <w:szCs w:val="28"/>
+        </w:rPr>
+      </w:pPr>
+      <w:r>
+        <w:rPr>
+          <w:b/>
+          <w:bCs/>
+          <w:sz w:val="28"/>
+          <w:szCs w:val="28"/>
+        </w:rPr>
+        <w:t>read('greeting')</w:t>
+      </w:r>
+    </w:p>
+    <w:p>
+      <w:pPr>
+        <w:jc w:val="both"/>
+        <w:rPr>
+          <w:b/>
+          <w:bCs/>
+          <w:sz w:val="28"/>
+          <w:szCs w:val="28"/>
+        </w:rPr>
+      </w:pPr>
+      <w:r>
+        <w:rPr>
+          <w:b/>
+          <w:bCs/>
+          <w:sz w:val="28"/>
+          <w:szCs w:val="28"/>
+        </w:rPr>
+        <w:t xml:space="preserve">   ↓</w:t>
+      </w:r>
+    </w:p>
+    <w:p>
+      <w:pPr>
+        <w:jc w:val="both"/>
+        <w:rPr>
+          <w:b/>
+          <w:bCs/>
+          <w:sz w:val="28"/>
+          <w:szCs w:val="28"/>
+        </w:rPr>
+      </w:pPr>
+      <w:r>
+        <w:rPr>
+          <w:b/>
+          <w:bCs/>
+          <w:sz w:val="28"/>
+          <w:szCs w:val="28"/>
+        </w:rPr>
+        <w:t>'Hello'</w:t>
+      </w:r>
+    </w:p>
+    <w:p>
+      <w:pPr>
+        <w:jc w:val="both"/>
+        <w:rPr>
+          <w:sz w:val="32"/>
+          <w:szCs w:val="32"/>
+        </w:rPr>
+      </w:pPr>
+      <w:r>
+        <w:rPr>
+          <w:sz w:val="32"/>
+          <w:szCs w:val="32"/>
+        </w:rPr>
+        <w:t xml:space="preserve"># </w:t>
+      </w:r>
+      <w:r>
+        <w:rPr>
+          <w:sz w:val="32"/>
+          <w:szCs w:val="32"/>
+        </w:rPr>
+        <w:t>And our generated code becomes:</w:t>
+      </w:r>
+    </w:p>
+    <w:p>
+      <w:pPr>
+        <w:jc w:val="both"/>
+        <w:rPr>
+          <w:b/>
+          <w:bCs/>
+          <w:color w:val="D86DCB" w:themeColor="accent5" w:themeTint="99"/>
+          <w:sz w:val="32"/>
+          <w:szCs w:val="32"/>
+        </w:rPr>
+      </w:pPr>
+      <w:r>
+        <w:rPr>
+          <w:b/>
+          <w:bCs/>
+          <w:color w:val="D86DCB" w:themeColor="accent5" w:themeTint="99"/>
+          <w:sz w:val="32"/>
+          <w:szCs w:val="32"/>
+        </w:rPr>
+        <w:t xml:space="preserve">extension </w:t>
+      </w:r>
+      <w:proofErr w:type="spellStart"/>
+      <w:r>
+        <w:rPr>
+          <w:b/>
+          <w:bCs/>
+          <w:color w:val="D86DCB" w:themeColor="accent5" w:themeTint="99"/>
+          <w:sz w:val="32"/>
+          <w:szCs w:val="32"/>
+        </w:rPr>
+        <w:t>UserGreeting</w:t>
+      </w:r>
+      <w:proofErr w:type="spellEnd"/>
+      <w:r>
+        <w:rPr>
+          <w:b/>
+          <w:bCs/>
+          <w:color w:val="D86DCB" w:themeColor="accent5" w:themeTint="99"/>
+          <w:sz w:val="32"/>
+          <w:szCs w:val="32"/>
+        </w:rPr>
+        <w:t xml:space="preserve"> on User {</w:t>
+      </w:r>
+    </w:p>
+    <w:p>
+      <w:pPr>
+        <w:jc w:val="both"/>
+        <w:rPr>
+          <w:b/>
+          <w:bCs/>
+          <w:color w:val="D86DCB" w:themeColor="accent5" w:themeTint="99"/>
+          <w:sz w:val="32"/>
+          <w:szCs w:val="32"/>
+        </w:rPr>
+      </w:pPr>
+      <w:r>
+        <w:rPr>
+          <w:b/>
+          <w:bCs/>
+          <w:color w:val="D86DCB" w:themeColor="accent5" w:themeTint="99"/>
+          <w:sz w:val="32"/>
+          <w:szCs w:val="32"/>
+        </w:rPr>
+        <w:t xml:space="preserve">  String </w:t>
+      </w:r>
+      <w:proofErr w:type="gramStart"/>
+      <w:r>
+        <w:rPr>
+          <w:b/>
+          <w:bCs/>
+          <w:color w:val="D86DCB" w:themeColor="accent5" w:themeTint="99"/>
+          <w:sz w:val="32"/>
+          <w:szCs w:val="32"/>
+        </w:rPr>
+        <w:t>greeting(</w:t>
+      </w:r>
+      <w:proofErr w:type="gramEnd"/>
+      <w:r>
+        <w:rPr>
+          <w:b/>
+          <w:bCs/>
+          <w:color w:val="D86DCB" w:themeColor="accent5" w:themeTint="99"/>
+          <w:sz w:val="32"/>
+          <w:szCs w:val="32"/>
+        </w:rPr>
+        <w:t>) =&gt; 'Hello, $name!';</w:t>
+      </w:r>
+    </w:p>
+    <w:p>
+      <w:pPr>
+        <w:jc w:val="both"/>
+        <w:rPr>
+          <w:b/>
+          <w:bCs/>
+          <w:color w:val="D86DCB" w:themeColor="accent5" w:themeTint="99"/>
+          <w:sz w:val="32"/>
+          <w:szCs w:val="32"/>
+        </w:rPr>
+      </w:pPr>
+      <w:r>
+        <w:rPr>
+          <w:b/>
+          <w:bCs/>
+          <w:color w:val="D86DCB" w:themeColor="accent5" w:themeTint="99"/>
+          <w:sz w:val="32"/>
+          <w:szCs w:val="32"/>
+        </w:rPr>
+        <w:t>}</w:t>
+      </w:r>
+    </w:p>
+    <w:p>
+      <w:pPr>
+        <w:jc w:val="both"/>
+        <w:rPr>
+          <w:sz w:val="32"/>
+          <w:szCs w:val="32"/>
+        </w:rPr>
+      </w:pPr>
+    </w:p>
+    <w:p>
+      <w:pPr>
+        <w:jc w:val="both"/>
+        <w:rPr>
+          <w:sz w:val="32"/>
+          <w:szCs w:val="32"/>
+        </w:rPr>
+      </w:pPr>
+      <w:r>
+        <w:rPr>
+          <w:sz w:val="32"/>
+          <w:szCs w:val="32"/>
+        </w:rPr>
+        <w:t xml:space="preserve"># </w:t>
+      </w:r>
+      <w:r>
+        <w:rPr>
+          <w:sz w:val="32"/>
+          <w:szCs w:val="32"/>
+        </w:rPr>
+        <w:t>With another value</w:t>
+      </w:r>
+      <w:r>
+        <w:rPr>
+          <w:sz w:val="32"/>
+          <w:szCs w:val="32"/>
+        </w:rPr>
+        <w:t xml:space="preserve"> </w:t>
+      </w:r>
+      <w:r>
+        <w:rPr>
+          <w:b/>
+          <w:bCs/>
+          <w:sz w:val="32"/>
+          <w:szCs w:val="32"/>
+        </w:rPr>
+        <w:t>@GenerateGreeting('Welcome')</w:t>
+      </w:r>
+      <w:r>
+        <w:rPr>
+          <w:sz w:val="32"/>
+          <w:szCs w:val="32"/>
+        </w:rPr>
+        <w:t xml:space="preserve"> ge</w:t>
+      </w:r>
+      <w:r>
+        <w:rPr>
+          <w:sz w:val="32"/>
+          <w:szCs w:val="32"/>
+        </w:rPr>
+        <w:t>nerates</w:t>
+      </w:r>
+      <w:r>
+        <w:rPr>
+          <w:sz w:val="32"/>
+          <w:szCs w:val="32"/>
+        </w:rPr>
+        <w:t xml:space="preserve"> </w:t>
+      </w:r>
+      <w:r>
+        <w:rPr>
+          <w:b/>
+          <w:bCs/>
+          <w:sz w:val="32"/>
+          <w:szCs w:val="32"/>
+        </w:rPr>
+        <w:t xml:space="preserve">String </w:t>
+      </w:r>
+      <w:proofErr w:type="gramStart"/>
+      <w:r>
+        <w:rPr>
+          <w:b/>
+          <w:bCs/>
+          <w:sz w:val="32"/>
+          <w:szCs w:val="32"/>
+        </w:rPr>
+        <w:t>greeting(</w:t>
+      </w:r>
+      <w:proofErr w:type="gramEnd"/>
+      <w:r>
+        <w:rPr>
+          <w:b/>
+          <w:bCs/>
+          <w:sz w:val="32"/>
+          <w:szCs w:val="32"/>
+        </w:rPr>
+        <w:t>) =&gt; 'Welcome, $name!';</w:t>
+      </w:r>
+    </w:p>
+    <w:p>
+      <w:pPr>
+        <w:jc w:val="both"/>
+        <w:rPr>
+          <w:sz w:val="32"/>
+          <w:szCs w:val="32"/>
+        </w:rPr>
+      </w:pPr>
+      <w:r>
+        <w:rPr>
+          <w:sz w:val="32"/>
+          <w:szCs w:val="32"/>
+        </w:rPr>
         <w:lastRenderedPageBreak/>
-        <w:t xml:space="preserve">    return '''</w:t>
-      </w:r>
-    </w:p>
-    <w:p>
-      <w:pPr>
-        <w:jc w:val="both"/>
-        <w:rPr>
-          <w:b/>
-          <w:bCs/>
-          <w:color w:val="D86DCB" w:themeColor="accent5" w:themeTint="99"/>
-          <w:sz w:val="32"/>
-          <w:szCs w:val="32"/>
-        </w:rPr>
-      </w:pPr>
-      <w:r>
-        <w:rPr>
-          <w:b/>
-          <w:bCs/>
-          <w:color w:val="D86DCB" w:themeColor="accent5" w:themeTint="99"/>
-          <w:sz w:val="32"/>
-          <w:szCs w:val="32"/>
-        </w:rPr>
-        <w:t>extension ${</w:t>
+        <w:t xml:space="preserve"># </w:t>
+      </w:r>
+      <w:r>
+        <w:rPr>
+          <w:sz w:val="32"/>
+          <w:szCs w:val="32"/>
+        </w:rPr>
+        <w:t>That's essentially how a generator can read arguments from something like:</w:t>
+      </w:r>
+    </w:p>
+    <w:p>
+      <w:pPr>
+        <w:jc w:val="both"/>
+        <w:rPr>
+          <w:b/>
+          <w:bCs/>
+          <w:color w:val="D86DCB" w:themeColor="accent5" w:themeTint="99"/>
+          <w:sz w:val="32"/>
+          <w:szCs w:val="32"/>
+        </w:rPr>
+      </w:pPr>
+      <w:r>
+        <w:rPr>
+          <w:b/>
+          <w:bCs/>
+          <w:color w:val="D86DCB" w:themeColor="accent5" w:themeTint="99"/>
+          <w:sz w:val="32"/>
+          <w:szCs w:val="32"/>
+        </w:rPr>
+        <w:t>@</w:t>
       </w:r>
       <w:proofErr w:type="gramStart"/>
       <w:r>
@@ -50466,585 +51099,9 @@
           <w:sz w:val="32"/>
           <w:szCs w:val="32"/>
         </w:rPr>
-        <w:t>element.name}Greeting</w:t>
+        <w:t>JsonSerializable(</w:t>
       </w:r>
       <w:proofErr w:type="gramEnd"/>
-      <w:r>
-        <w:rPr>
-          <w:b/>
-          <w:bCs/>
-          <w:color w:val="D86DCB" w:themeColor="accent5" w:themeTint="99"/>
-          <w:sz w:val="32"/>
-          <w:szCs w:val="32"/>
-        </w:rPr>
-        <w:t xml:space="preserve"> on ${element.name} {</w:t>
-      </w:r>
-    </w:p>
-    <w:p>
-      <w:pPr>
-        <w:jc w:val="both"/>
-        <w:rPr>
-          <w:b/>
-          <w:bCs/>
-          <w:color w:val="D86DCB" w:themeColor="accent5" w:themeTint="99"/>
-          <w:sz w:val="32"/>
-          <w:szCs w:val="32"/>
-        </w:rPr>
-      </w:pPr>
-      <w:r>
-        <w:rPr>
-          <w:b/>
-          <w:bCs/>
-          <w:color w:val="D86DCB" w:themeColor="accent5" w:themeTint="99"/>
-          <w:sz w:val="32"/>
-          <w:szCs w:val="32"/>
-        </w:rPr>
-        <w:t xml:space="preserve">  String </w:t>
-      </w:r>
-      <w:proofErr w:type="gramStart"/>
-      <w:r>
-        <w:rPr>
-          <w:b/>
-          <w:bCs/>
-          <w:color w:val="D86DCB" w:themeColor="accent5" w:themeTint="99"/>
-          <w:sz w:val="32"/>
-          <w:szCs w:val="32"/>
-        </w:rPr>
-        <w:t>greeting(</w:t>
-      </w:r>
-      <w:proofErr w:type="gramEnd"/>
-      <w:r>
-        <w:rPr>
-          <w:b/>
-          <w:bCs/>
-          <w:color w:val="D86DCB" w:themeColor="accent5" w:themeTint="99"/>
-          <w:sz w:val="32"/>
-          <w:szCs w:val="32"/>
-        </w:rPr>
-        <w:t>) =&gt; '$greeting, \$name!';</w:t>
-      </w:r>
-    </w:p>
-    <w:p>
-      <w:pPr>
-        <w:jc w:val="both"/>
-        <w:rPr>
-          <w:b/>
-          <w:bCs/>
-          <w:color w:val="D86DCB" w:themeColor="accent5" w:themeTint="99"/>
-          <w:sz w:val="32"/>
-          <w:szCs w:val="32"/>
-        </w:rPr>
-      </w:pPr>
-      <w:r>
-        <w:rPr>
-          <w:b/>
-          <w:bCs/>
-          <w:color w:val="D86DCB" w:themeColor="accent5" w:themeTint="99"/>
-          <w:sz w:val="32"/>
-          <w:szCs w:val="32"/>
-        </w:rPr>
-        <w:t>}</w:t>
-      </w:r>
-    </w:p>
-    <w:p>
-      <w:pPr>
-        <w:jc w:val="both"/>
-        <w:rPr>
-          <w:b/>
-          <w:bCs/>
-          <w:color w:val="D86DCB" w:themeColor="accent5" w:themeTint="99"/>
-          <w:sz w:val="32"/>
-          <w:szCs w:val="32"/>
-        </w:rPr>
-      </w:pPr>
-      <w:r>
-        <w:rPr>
-          <w:b/>
-          <w:bCs/>
-          <w:color w:val="D86DCB" w:themeColor="accent5" w:themeTint="99"/>
-          <w:sz w:val="32"/>
-          <w:szCs w:val="32"/>
-        </w:rPr>
-        <w:t>''';</w:t>
-      </w:r>
-    </w:p>
-    <w:p>
-      <w:pPr>
-        <w:jc w:val="both"/>
-        <w:rPr>
-          <w:b/>
-          <w:bCs/>
-          <w:color w:val="D86DCB" w:themeColor="accent5" w:themeTint="99"/>
-          <w:sz w:val="32"/>
-          <w:szCs w:val="32"/>
-        </w:rPr>
-      </w:pPr>
-      <w:r>
-        <w:rPr>
-          <w:b/>
-          <w:bCs/>
-          <w:color w:val="D86DCB" w:themeColor="accent5" w:themeTint="99"/>
-          <w:sz w:val="32"/>
-          <w:szCs w:val="32"/>
-        </w:rPr>
-        <w:t xml:space="preserve">  }</w:t>
-      </w:r>
-    </w:p>
-    <w:p>
-      <w:pPr>
-        <w:jc w:val="both"/>
-        <w:rPr>
-          <w:b/>
-          <w:bCs/>
-          <w:color w:val="D86DCB" w:themeColor="accent5" w:themeTint="99"/>
-          <w:sz w:val="32"/>
-          <w:szCs w:val="32"/>
-        </w:rPr>
-      </w:pPr>
-      <w:r>
-        <w:rPr>
-          <w:b/>
-          <w:bCs/>
-          <w:color w:val="D86DCB" w:themeColor="accent5" w:themeTint="99"/>
-          <w:sz w:val="32"/>
-          <w:szCs w:val="32"/>
-        </w:rPr>
-        <w:t>}</w:t>
-      </w:r>
-    </w:p>
-    <w:p>
-      <w:pPr>
-        <w:jc w:val="both"/>
-        <w:rPr>
-          <w:sz w:val="32"/>
-          <w:szCs w:val="32"/>
-        </w:rPr>
-      </w:pPr>
-      <w:r>
-        <w:rPr>
-          <w:sz w:val="32"/>
-          <w:szCs w:val="32"/>
-        </w:rPr>
-        <w:t xml:space="preserve"># </w:t>
-      </w:r>
-      <w:r>
-        <w:rPr>
-          <w:sz w:val="32"/>
-          <w:szCs w:val="32"/>
-        </w:rPr>
-        <w:t>So</w:t>
-      </w:r>
-      <w:r>
-        <w:rPr>
-          <w:sz w:val="32"/>
-          <w:szCs w:val="32"/>
-        </w:rPr>
-        <w:t xml:space="preserve">, </w:t>
-      </w:r>
-      <w:r>
-        <w:rPr>
-          <w:b/>
-          <w:bCs/>
-          <w:sz w:val="32"/>
-          <w:szCs w:val="32"/>
-        </w:rPr>
-        <w:t xml:space="preserve">@GenerateGreeting('Hello') </w:t>
-      </w:r>
-      <w:r>
-        <w:rPr>
-          <w:sz w:val="32"/>
-          <w:szCs w:val="32"/>
-        </w:rPr>
-        <w:t>becomes:</w:t>
-      </w:r>
-    </w:p>
-    <w:p>
-      <w:pPr>
-        <w:jc w:val="both"/>
-        <w:rPr>
-          <w:b/>
-          <w:bCs/>
-          <w:sz w:val="28"/>
-          <w:szCs w:val="28"/>
-        </w:rPr>
-      </w:pPr>
-      <w:r>
-        <w:rPr>
-          <w:b/>
-          <w:bCs/>
-          <w:sz w:val="28"/>
-          <w:szCs w:val="28"/>
-        </w:rPr>
-        <w:t>annotation</w:t>
-      </w:r>
-    </w:p>
-    <w:p>
-      <w:pPr>
-        <w:jc w:val="both"/>
-        <w:rPr>
-          <w:b/>
-          <w:bCs/>
-          <w:sz w:val="28"/>
-          <w:szCs w:val="28"/>
-        </w:rPr>
-      </w:pPr>
-      <w:r>
-        <w:rPr>
-          <w:b/>
-          <w:bCs/>
-          <w:sz w:val="28"/>
-          <w:szCs w:val="28"/>
-        </w:rPr>
-        <w:t xml:space="preserve">   ↓</w:t>
-      </w:r>
-    </w:p>
-    <w:p>
-      <w:pPr>
-        <w:jc w:val="both"/>
-        <w:rPr>
-          <w:b/>
-          <w:bCs/>
-          <w:sz w:val="28"/>
-          <w:szCs w:val="28"/>
-        </w:rPr>
-      </w:pPr>
-      <w:r>
-        <w:rPr>
-          <w:b/>
-          <w:bCs/>
-          <w:sz w:val="28"/>
-          <w:szCs w:val="28"/>
-        </w:rPr>
-        <w:t>read('greeting')</w:t>
-      </w:r>
-    </w:p>
-    <w:p>
-      <w:pPr>
-        <w:jc w:val="both"/>
-        <w:rPr>
-          <w:b/>
-          <w:bCs/>
-          <w:sz w:val="28"/>
-          <w:szCs w:val="28"/>
-        </w:rPr>
-      </w:pPr>
-      <w:r>
-        <w:rPr>
-          <w:b/>
-          <w:bCs/>
-          <w:sz w:val="28"/>
-          <w:szCs w:val="28"/>
-        </w:rPr>
-        <w:t xml:space="preserve">   ↓</w:t>
-      </w:r>
-    </w:p>
-    <w:p>
-      <w:pPr>
-        <w:jc w:val="both"/>
-        <w:rPr>
-          <w:b/>
-          <w:bCs/>
-          <w:sz w:val="28"/>
-          <w:szCs w:val="28"/>
-        </w:rPr>
-      </w:pPr>
-      <w:r>
-        <w:rPr>
-          <w:b/>
-          <w:bCs/>
-          <w:sz w:val="28"/>
-          <w:szCs w:val="28"/>
-        </w:rPr>
-        <w:t>'Hello'</w:t>
-      </w:r>
-    </w:p>
-    <w:p>
-      <w:pPr>
-        <w:jc w:val="both"/>
-        <w:rPr>
-          <w:sz w:val="32"/>
-          <w:szCs w:val="32"/>
-        </w:rPr>
-      </w:pPr>
-      <w:r>
-        <w:rPr>
-          <w:sz w:val="32"/>
-          <w:szCs w:val="32"/>
-        </w:rPr>
-        <w:t xml:space="preserve"># </w:t>
-      </w:r>
-      <w:r>
-        <w:rPr>
-          <w:sz w:val="32"/>
-          <w:szCs w:val="32"/>
-        </w:rPr>
-        <w:t>And our generated code becomes:</w:t>
-      </w:r>
-    </w:p>
-    <w:p>
-      <w:pPr>
-        <w:jc w:val="both"/>
-        <w:rPr>
-          <w:b/>
-          <w:bCs/>
-          <w:color w:val="D86DCB" w:themeColor="accent5" w:themeTint="99"/>
-          <w:sz w:val="32"/>
-          <w:szCs w:val="32"/>
-        </w:rPr>
-      </w:pPr>
-      <w:r>
-        <w:rPr>
-          <w:b/>
-          <w:bCs/>
-          <w:color w:val="D86DCB" w:themeColor="accent5" w:themeTint="99"/>
-          <w:sz w:val="32"/>
-          <w:szCs w:val="32"/>
-        </w:rPr>
-        <w:t xml:space="preserve">extension </w:t>
-      </w:r>
-      <w:proofErr w:type="spellStart"/>
-      <w:r>
-        <w:rPr>
-          <w:b/>
-          <w:bCs/>
-          <w:color w:val="D86DCB" w:themeColor="accent5" w:themeTint="99"/>
-          <w:sz w:val="32"/>
-          <w:szCs w:val="32"/>
-        </w:rPr>
-        <w:t>UserGreeting</w:t>
-      </w:r>
-      <w:proofErr w:type="spellEnd"/>
-      <w:r>
-        <w:rPr>
-          <w:b/>
-          <w:bCs/>
-          <w:color w:val="D86DCB" w:themeColor="accent5" w:themeTint="99"/>
-          <w:sz w:val="32"/>
-          <w:szCs w:val="32"/>
-        </w:rPr>
-        <w:t xml:space="preserve"> on User {</w:t>
-      </w:r>
-    </w:p>
-    <w:p>
-      <w:pPr>
-        <w:jc w:val="both"/>
-        <w:rPr>
-          <w:b/>
-          <w:bCs/>
-          <w:color w:val="D86DCB" w:themeColor="accent5" w:themeTint="99"/>
-          <w:sz w:val="32"/>
-          <w:szCs w:val="32"/>
-        </w:rPr>
-      </w:pPr>
-      <w:r>
-        <w:rPr>
-          <w:b/>
-          <w:bCs/>
-          <w:color w:val="D86DCB" w:themeColor="accent5" w:themeTint="99"/>
-          <w:sz w:val="32"/>
-          <w:szCs w:val="32"/>
-        </w:rPr>
-        <w:t xml:space="preserve">  String </w:t>
-      </w:r>
-      <w:proofErr w:type="gramStart"/>
-      <w:r>
-        <w:rPr>
-          <w:b/>
-          <w:bCs/>
-          <w:color w:val="D86DCB" w:themeColor="accent5" w:themeTint="99"/>
-          <w:sz w:val="32"/>
-          <w:szCs w:val="32"/>
-        </w:rPr>
-        <w:t>greeting(</w:t>
-      </w:r>
-      <w:proofErr w:type="gramEnd"/>
-      <w:r>
-        <w:rPr>
-          <w:b/>
-          <w:bCs/>
-          <w:color w:val="D86DCB" w:themeColor="accent5" w:themeTint="99"/>
-          <w:sz w:val="32"/>
-          <w:szCs w:val="32"/>
-        </w:rPr>
-        <w:t>) =&gt; 'Hello, $name!';</w:t>
-      </w:r>
-    </w:p>
-    <w:p>
-      <w:pPr>
-        <w:jc w:val="both"/>
-        <w:rPr>
-          <w:b/>
-          <w:bCs/>
-          <w:color w:val="D86DCB" w:themeColor="accent5" w:themeTint="99"/>
-          <w:sz w:val="32"/>
-          <w:szCs w:val="32"/>
-        </w:rPr>
-      </w:pPr>
-      <w:r>
-        <w:rPr>
-          <w:b/>
-          <w:bCs/>
-          <w:color w:val="D86DCB" w:themeColor="accent5" w:themeTint="99"/>
-          <w:sz w:val="32"/>
-          <w:szCs w:val="32"/>
-        </w:rPr>
-        <w:t>}</w:t>
-      </w:r>
-    </w:p>
-    <w:p>
-      <w:pPr>
-        <w:jc w:val="both"/>
-        <w:rPr>
-          <w:sz w:val="32"/>
-          <w:szCs w:val="32"/>
-        </w:rPr>
-      </w:pPr>
-    </w:p>
-    <w:p>
-      <w:pPr>
-        <w:jc w:val="both"/>
-        <w:rPr>
-          <w:sz w:val="32"/>
-          <w:szCs w:val="32"/>
-        </w:rPr>
-      </w:pPr>
-      <w:r>
-        <w:rPr>
-          <w:sz w:val="32"/>
-          <w:szCs w:val="32"/>
-        </w:rPr>
-        <w:t xml:space="preserve"># </w:t>
-      </w:r>
-      <w:r>
-        <w:rPr>
-          <w:sz w:val="32"/>
-          <w:szCs w:val="32"/>
-        </w:rPr>
-        <w:t>With another value</w:t>
-      </w:r>
-      <w:r>
-        <w:rPr>
-          <w:sz w:val="32"/>
-          <w:szCs w:val="32"/>
-        </w:rPr>
-        <w:t xml:space="preserve"> </w:t>
-      </w:r>
-      <w:r>
-        <w:rPr>
-          <w:b/>
-          <w:bCs/>
-          <w:sz w:val="32"/>
-          <w:szCs w:val="32"/>
-        </w:rPr>
-        <w:t>@GenerateGreeting('Welcome')</w:t>
-      </w:r>
-      <w:r>
-        <w:rPr>
-          <w:sz w:val="32"/>
-          <w:szCs w:val="32"/>
-        </w:rPr>
-        <w:t xml:space="preserve"> ge</w:t>
-      </w:r>
-      <w:r>
-        <w:rPr>
-          <w:sz w:val="32"/>
-          <w:szCs w:val="32"/>
-        </w:rPr>
-        <w:t>nerates</w:t>
-      </w:r>
-      <w:r>
-        <w:rPr>
-          <w:sz w:val="32"/>
-          <w:szCs w:val="32"/>
-        </w:rPr>
-        <w:t xml:space="preserve"> </w:t>
-      </w:r>
-      <w:r>
-        <w:rPr>
-          <w:b/>
-          <w:bCs/>
-          <w:sz w:val="32"/>
-          <w:szCs w:val="32"/>
-        </w:rPr>
-        <w:t xml:space="preserve">String </w:t>
-      </w:r>
-      <w:proofErr w:type="gramStart"/>
-      <w:r>
-        <w:rPr>
-          <w:b/>
-          <w:bCs/>
-          <w:sz w:val="32"/>
-          <w:szCs w:val="32"/>
-        </w:rPr>
-        <w:t>greeting(</w:t>
-      </w:r>
-      <w:proofErr w:type="gramEnd"/>
-      <w:r>
-        <w:rPr>
-          <w:b/>
-          <w:bCs/>
-          <w:sz w:val="32"/>
-          <w:szCs w:val="32"/>
-        </w:rPr>
-        <w:t>) =&gt; 'Welcome, $name!';</w:t>
-      </w:r>
-    </w:p>
-    <w:p>
-      <w:pPr>
-        <w:jc w:val="both"/>
-        <w:rPr>
-          <w:sz w:val="32"/>
-          <w:szCs w:val="32"/>
-        </w:rPr>
-      </w:pPr>
-      <w:r>
-        <w:rPr>
-          <w:sz w:val="32"/>
-          <w:szCs w:val="32"/>
-        </w:rPr>
-        <w:t xml:space="preserve"># </w:t>
-      </w:r>
-      <w:r>
-        <w:rPr>
-          <w:sz w:val="32"/>
-          <w:szCs w:val="32"/>
-        </w:rPr>
-        <w:t>That's essentially how a generator can read arguments from something like:</w:t>
-      </w:r>
-    </w:p>
-    <w:p>
-      <w:pPr>
-        <w:jc w:val="both"/>
-        <w:rPr>
-          <w:b/>
-          <w:bCs/>
-          <w:color w:val="D86DCB" w:themeColor="accent5" w:themeTint="99"/>
-          <w:sz w:val="32"/>
-          <w:szCs w:val="32"/>
-        </w:rPr>
-      </w:pPr>
-      <w:r>
-        <w:rPr>
-          <w:b/>
-          <w:bCs/>
-          <w:color w:val="D86DCB" w:themeColor="accent5" w:themeTint="99"/>
-          <w:sz w:val="32"/>
-          <w:szCs w:val="32"/>
-        </w:rPr>
-        <w:t>@</w:t>
-      </w:r>
-      <w:proofErr w:type="gramStart"/>
-      <w:r>
-        <w:rPr>
-          <w:b/>
-          <w:bCs/>
-          <w:color w:val="D86DCB" w:themeColor="accent5" w:themeTint="99"/>
-          <w:sz w:val="32"/>
-          <w:szCs w:val="32"/>
-        </w:rPr>
-        <w:t>JsonSerializable(</w:t>
-      </w:r>
-      <w:proofErr w:type="gramEnd"/>
     </w:p>
     <w:p>
       <w:pPr>
@@ -51131,7 +51188,6 @@
           <w:sz w:val="32"/>
           <w:szCs w:val="32"/>
         </w:rPr>
-        <w:lastRenderedPageBreak/>
         <w:t xml:space="preserve">  </w:t>
       </w:r>
       <w:proofErr w:type="spellStart"/>

</xml_diff>